<commit_message>
Complete reproducible evaluation and five-page project report
</commit_message>
<xml_diff>
--- a/P20_Fuzzy_TOPSIS_Report.docx
+++ b/P20_Fuzzy_TOPSIS_Report.docx
@@ -4,34 +4,15 @@
   <w:body>
     <w:p>
       <w:pPr>
-        <w:jc w:val="center"/>
+        <w:pStyle w:val="Title"/>
       </w:pPr>
       <w:r>
-        <w:rPr>
-          <w:rFonts w:ascii="Times New Roman" w:hAnsi="Times New Roman"/>
-          <w:b/>
-          <w:color w:val="000000"/>
-          <w:sz w:val="32"/>
-        </w:rPr>
         <w:t>A Fuzzy TOPSIS Framework for Prioritising Pedestrian Crossing Safety and Accessibility Improvements</w:t>
       </w:r>
     </w:p>
     <w:p>
-      <w:pPr>
-        <w:jc w:val="center"/>
-      </w:pPr>
       <w:r>
-        <w:t>Soft Computing Assignment P20 | Indian Institute of Information Technology Kottayam</w:t>
-      </w:r>
-    </w:p>
-    <w:p>
-      <w:r>
-        <w:t>Abstract—This paper specifies an executable fuzzy TOPSIS decision-support model for ordering feasible pedestrian-crossing upgrade packages. The decision is intervention priority, not crash prediction or proof of treatment effectiveness. The supplied materials contained no site inventory or field observations, so empirical rankings remain pending. Four baseline criteria cover pedestrian demand, vehicle exposure, accessibility deficiency, and crossing-control or visibility deficiency; an extension adds verified essential-destination access. Observed count variation and paired assessor disagreement are approximated by triangular fuzzy numbers. The model uses Chen’s vertex distance, summed across criteria, and a documented adaptation with crisp equal weights and attainable weighted ideals. A command-line pipeline creates base, crisp, extension, and weight-sensitivity results when observations are available. Synthetic records demonstrate only the arithmetic. Five test cases passed, including a separately calculated two-criterion example. The proposed campus study still needs a verified crossing inventory, repeated observations, engineering review, and independent validation.</w:t>
-      </w:r>
-    </w:p>
-    <w:p>
-      <w:r>
-        <w:t>Keywords—fuzzy TOPSIS, pedestrian crossings, accessibility, intervention prioritisation, decision support</w:t>
+        <w:t>Soft Computing Assignment P20 • IIIT Kottayam</w:t>
       </w:r>
     </w:p>
     <w:p>
@@ -39,17 +20,17 @@
         <w:pStyle w:val="Heading1"/>
       </w:pPr>
       <w:r>
-        <w:t>1. Problem and research question</w:t>
+        <w:t>Abstract</w:t>
       </w:r>
     </w:p>
     <w:p>
       <w:r>
-        <w:t>The decision is which feasible improvement package should receive attention first from campus facilities and the responsible road authority. Each alternative is one documented action package at a verified crossing, such as an access-ramp and tactile-cue repair or a control and visibility improvement. The proposed boundary is crossing points within the IIIT Kottayam campus and immediately adjoining public-road approaches. This boundary and the existence of candidate crossings require field confirmation. One package per crossing prevents the same site conditions being counted as separate competing actions. A higher closeness score means higher relative priority among the included packages; it is not an accident probability or proof that the action will reduce crashes.</w:t>
+        <w:t>This project develops a reproducible decision-support procedure for prioritising feasible pedestrian-crossing improvement packages. Four baseline criteria describe pedestrian demand, vehicle exposure, accessibility deficiency and control or visibility deficiency. Triangular fuzzy numbers express documented observation ranges or assessor disagreement. A declared adaptation of triangular fuzzy TOPSIS combines observed-range normalisation, provisional equal weights and summed vertex distances. An extension adds essential-destination access importance. Four hypothetical alternatives demonstrate the complete pipeline; no site survey or empirical priority list is claimed. Evaluation compares a crisp baseline, the extension, 1,000 weight perturbations and three uncertainty-width scenarios. The example shows that a stable leading candidate under some assumptions can coexist with substantial changes elsewhere in the ranking. Collection forms, calculation traces, tests and source records support subsequent field application. Independent validation and engineering review remain necessary before a real allocation decision.</w:t>
       </w:r>
     </w:p>
     <w:p>
       <w:r>
-        <w:t>Research question: under repeated field measurements and provisional equal weights, does adding verified essential-destination access change the leading feasible crossing-upgrade packages or the stability of the top group? The comparison tests a defined extension to the local deficiency-and-demand model. It does not claim that the extension improves decisions unless independent review supports that conclusion.</w:t>
+        <w:t>Keywords: pedestrian crossings; accessibility; triangular fuzzy numbers; TOPSIS; sensitivity analysis</w:t>
       </w:r>
     </w:p>
     <w:p>
@@ -57,242 +38,315 @@
         <w:pStyle w:val="Heading1"/>
       </w:pPr>
       <w:r>
-        <w:t>2. Related work</w:t>
+        <w:t>1 Introduction and decision scope</w:t>
+      </w:r>
+    </w:p>
+    <w:p>
+      <w:r>
+        <w:t>A crossing improvement decision combines evidence measured in different units and observations that vary across time or assessors. A transparent ranking can help reviewers identify packages requiring attention, provided the score is interpreted within its candidate set. The decision here is which feasible package should receive earlier review. It is neither an estimate of accident probability nor a calculation of treatment effectiveness. A package may combine related actions at one crossing; choosing among multiple competing designs at the same site requires a separate engineering assessment.</w:t>
+      </w:r>
+    </w:p>
+    <w:p>
+      <w:r>
+        <w:t>The proposed study boundary covers the IIIT Kottayam campus and immediately adjoining public-road approaches. This is a study design: the crossing inventory and boundary have not been verified on site. Candidate records must identify a crossing, describe its proposed intervention, cite photographs and state feasibility. Only one eligible package per crossing enters the comparison. Rejected candidates retain a written reason. The campus facilities team and relevant road authority are the intended reviewers; the algorithm cannot grant approval or establish compliance.</w:t>
+      </w:r>
+    </w:p>
+    <w:p>
+      <w:pPr>
+        <w:pStyle w:val="Heading1"/>
+      </w:pPr>
+      <w:r>
+        <w:t>2 Research question and contribution</w:t>
+      </w:r>
+    </w:p>
+    <w:p>
+      <w:r>
+        <w:t>The research question is whether adding essential-destination access changes the ordering or top group after local demand and deficiency criteria have been held fixed. The contribution is an inspectable implementation and an explicit comparison protocol. Applying TOPSIS at a new location alone is not a novelty claim. A changed ranking demonstrates that the additional criterion matters mathematically; it does not establish that the revised recommendation is better. That judgement needs evidence independent of the inputs.</w:t>
+      </w:r>
+    </w:p>
+    <w:p>
+      <w:r>
+        <w:br w:type="page"/>
+      </w:r>
+    </w:p>
+    <w:p>
+      <w:pPr>
+        <w:pStyle w:val="Heading1"/>
+      </w:pPr>
+      <w:r>
+        <w:t>3 Related work and evidence sources</w:t>
+      </w:r>
+    </w:p>
+    <w:p>
+      <w:r>
+        <w:t>Structured inspection is a relevant precedent, but the decision target and geographical setting matter. Table 1 distinguishes crossing assessment, pedestrian satisfaction and behavioural modelling. The detailed source register records verified bibliographic metadata, access dates and reuse conditions. Claims from abstracts are kept at abstract level; inaccessible details have not been reconstructed.</w:t>
+      </w:r>
+    </w:p>
+    <w:p>
+      <w:r>
+        <w:t>Table 1. Literature comparison and transfer limits</w:t>
       </w:r>
     </w:p>
     <w:tbl>
       <w:tblPr>
-        <w:tblStyle w:val="TableGrid"/>
+        <w:tblStyle w:val="LightShading-Accent1"/>
         <w:tblW w:type="auto" w:w="0"/>
         <w:tblLook w:firstColumn="1" w:firstRow="1" w:lastColumn="0" w:lastRow="0" w:noHBand="0" w:noVBand="1" w:val="04A0"/>
       </w:tblPr>
       <w:tblGrid>
-        <w:gridCol w:w="2556"/>
-        <w:gridCol w:w="2556"/>
-        <w:gridCol w:w="2556"/>
-        <w:gridCol w:w="2556"/>
+        <w:gridCol w:w="3250"/>
+        <w:gridCol w:w="3250"/>
+        <w:gridCol w:w="3250"/>
       </w:tblGrid>
       <w:tr>
         <w:trPr>
-          <w:cantSplit/>
+          <w:tblHeader/>
         </w:trPr>
         <w:tc>
           <w:tcPr>
-            <w:tcW w:type="dxa" w:w="2556"/>
+            <w:tcW w:type="dxa" w:w="3250"/>
           </w:tcPr>
           <w:p>
+            <w:pPr>
+              <w:spacing w:after="80"/>
+            </w:pPr>
             <w:r>
+              <w:rPr>
+                <w:sz w:val="20"/>
+              </w:rPr>
               <w:t>Study</w:t>
             </w:r>
           </w:p>
         </w:tc>
         <w:tc>
           <w:tcPr>
-            <w:tcW w:type="dxa" w:w="2556"/>
+            <w:tcW w:type="dxa" w:w="3250"/>
           </w:tcPr>
           <w:p>
+            <w:pPr>
+              <w:spacing w:after="80"/>
+            </w:pPr>
             <w:r>
-              <w:t>Setting / method</w:t>
+              <w:rPr>
+                <w:sz w:val="20"/>
+              </w:rPr>
+              <w:t>Question and method</w:t>
             </w:r>
           </w:p>
         </w:tc>
         <w:tc>
           <w:tcPr>
-            <w:tcW w:type="dxa" w:w="2556"/>
+            <w:tcW w:type="dxa" w:w="3250"/>
           </w:tcPr>
           <w:p>
+            <w:pPr>
+              <w:spacing w:after="80"/>
+            </w:pPr>
             <w:r>
-              <w:t>Evidence and useful result</w:t>
+              <w:rPr>
+                <w:sz w:val="20"/>
+              </w:rPr>
+              <w:t>Project implication</w:t>
+            </w:r>
+          </w:p>
+        </w:tc>
+      </w:tr>
+      <w:tr>
+        <w:tc>
+          <w:tcPr>
+            <w:tcW w:type="dxa" w:w="3250"/>
+          </w:tcPr>
+          <w:p>
+            <w:pPr>
+              <w:spacing w:after="80"/>
+            </w:pPr>
+            <w:r>
+              <w:rPr>
+                <w:sz w:val="20"/>
+              </w:rPr>
+              <w:t>Battistini et al. [1]</w:t>
             </w:r>
           </w:p>
         </w:tc>
         <w:tc>
           <w:tcPr>
-            <w:tcW w:type="dxa" w:w="2556"/>
+            <w:tcW w:type="dxa" w:w="3250"/>
           </w:tcPr>
           <w:p>
+            <w:pPr>
+              <w:spacing w:after="80"/>
+            </w:pPr>
             <w:r>
-              <w:t>Limit for this project</w:t>
+              <w:rPr>
+                <w:sz w:val="20"/>
+              </w:rPr>
+              <w:t>Checklist-based decision support at ten unsignalized crossings on two Bologna roads.</w:t>
+            </w:r>
+          </w:p>
+        </w:tc>
+        <w:tc>
+          <w:tcPr>
+            <w:tcW w:type="dxa" w:w="3250"/>
+          </w:tcPr>
+          <w:p>
+            <w:pPr>
+              <w:spacing w:after="80"/>
+            </w:pPr>
+            <w:r>
+              <w:rPr>
+                <w:sz w:val="20"/>
+              </w:rPr>
+              <w:t>Supports systematic site inspection; Italian scores are not local compliance thresholds.</w:t>
             </w:r>
           </w:p>
         </w:tc>
       </w:tr>
       <w:tr>
-        <w:trPr>
-          <w:cantSplit/>
-        </w:trPr>
         <w:tc>
           <w:tcPr>
-            <w:tcW w:type="dxa" w:w="2556"/>
+            <w:tcW w:type="dxa" w:w="3250"/>
           </w:tcPr>
           <w:p>
+            <w:pPr>
+              <w:spacing w:after="80"/>
+            </w:pPr>
             <w:r>
-              <w:t>Pedestrian-crossing safety decision support (2023), Transportation Research Procedia 69, 655–662; DOI 10.1016/j.trpro.2023.02.220</w:t>
+              <w:rPr>
+                <w:sz w:val="20"/>
+              </w:rPr>
+              <w:t>Majumdar et al. [2]</w:t>
             </w:r>
           </w:p>
         </w:tc>
         <w:tc>
           <w:tcPr>
-            <w:tcW w:type="dxa" w:w="2556"/>
+            <w:tcW w:type="dxa" w:w="3250"/>
           </w:tcPr>
           <w:p>
+            <w:pPr>
+              <w:spacing w:after="80"/>
+            </w:pPr>
             <w:r>
-              <w:t>Checklist-based assessment; 10 unsignalized crossings on two Bologna roads</w:t>
+              <w:rPr>
+                <w:sz w:val="20"/>
+              </w:rPr>
+              <w:t>Pedestrian satisfaction and TOPSIS prioritisation of sidewalk and crosswalk attributes.</w:t>
             </w:r>
           </w:p>
         </w:tc>
         <w:tc>
           <w:tcPr>
-            <w:tcW w:type="dxa" w:w="2556"/>
+            <w:tcW w:type="dxa" w:w="3250"/>
           </w:tcPr>
           <w:p>
+            <w:pPr>
+              <w:spacing w:after="80"/>
+            </w:pPr>
             <w:r>
-              <w:t>On-site checklist produced intervention priorities used in a municipal safety plan.</w:t>
+              <w:rPr>
+                <w:sz w:val="20"/>
+              </w:rPr>
+              <w:t>Supports pedestrian-focused criteria; ranking attributes differs from ranking site packages.</w:t>
+            </w:r>
+          </w:p>
+        </w:tc>
+      </w:tr>
+      <w:tr>
+        <w:tc>
+          <w:tcPr>
+            <w:tcW w:type="dxa" w:w="3250"/>
+          </w:tcPr>
+          <w:p>
+            <w:pPr>
+              <w:spacing w:after="80"/>
+            </w:pPr>
+            <w:r>
+              <w:rPr>
+                <w:sz w:val="20"/>
+              </w:rPr>
+              <w:t>Alver and Katanalp [3]</w:t>
             </w:r>
           </w:p>
         </w:tc>
         <w:tc>
           <w:tcPr>
-            <w:tcW w:type="dxa" w:w="2556"/>
+            <w:tcW w:type="dxa" w:w="3250"/>
           </w:tcPr>
           <w:p>
+            <w:pPr>
+              <w:spacing w:after="80"/>
+            </w:pPr>
             <w:r>
-              <w:t>Local safety-rating instrument; not transferable as a universal India checklist.</w:t>
+              <w:rPr>
+                <w:sz w:val="20"/>
+              </w:rPr>
+              <w:t>Integrated AHP and fuzzy logic for gap acceptance at semicontrolled crossings.</w:t>
+            </w:r>
+          </w:p>
+        </w:tc>
+        <w:tc>
+          <w:tcPr>
+            <w:tcW w:type="dxa" w:w="3250"/>
+          </w:tcPr>
+          <w:p>
+            <w:pPr>
+              <w:spacing w:after="80"/>
+            </w:pPr>
+            <w:r>
+              <w:rPr>
+                <w:sz w:val="20"/>
+              </w:rPr>
+              <w:t>Shows a transport application of fuzzy modelling; does not validate these ratings.</w:t>
             </w:r>
           </w:p>
         </w:tc>
       </w:tr>
       <w:tr>
-        <w:trPr>
-          <w:cantSplit/>
-        </w:trPr>
         <w:tc>
           <w:tcPr>
-            <w:tcW w:type="dxa" w:w="2556"/>
+            <w:tcW w:type="dxa" w:w="3250"/>
           </w:tcPr>
           <w:p>
+            <w:pPr>
+              <w:spacing w:after="80"/>
+            </w:pPr>
             <w:r>
-              <w:t>Pedestrian Satisfaction-Based Methodology for Prioritization of Critical Sidewalk and Crosswalk Attributes Influencing Walkability (2021), Journal of Urban Planning and Development 147(3); DOI 10.1061/(ASCE)UP.1943-5444.0000718</w:t>
+              <w:rPr>
+                <w:sz w:val="20"/>
+              </w:rPr>
+              <w:t>Chen [4]; Jefmański and Sagan [5]</w:t>
             </w:r>
           </w:p>
         </w:tc>
         <w:tc>
           <w:tcPr>
-            <w:tcW w:type="dxa" w:w="2556"/>
+            <w:tcW w:type="dxa" w:w="3250"/>
           </w:tcPr>
           <w:p>
+            <w:pPr>
+              <w:spacing w:after="80"/>
+            </w:pPr>
             <w:r>
-              <w:t>Pedestrian satisfaction evidence with TOPSIS prioritisation</w:t>
+              <w:rPr>
+                <w:sz w:val="20"/>
+              </w:rPr>
+              <w:t>Triangular fuzzy TOPSIS foundation and analysis of fuzzy scale choices.</w:t>
             </w:r>
           </w:p>
         </w:tc>
         <w:tc>
           <w:tcPr>
-            <w:tcW w:type="dxa" w:w="2556"/>
+            <w:tcW w:type="dxa" w:w="3250"/>
           </w:tcPr>
           <w:p>
+            <w:pPr>
+              <w:spacing w:after="80"/>
+            </w:pPr>
             <w:r>
-              <w:t>Highlights stop-line behaviour, turning conflicts, zebra markings and holding space in the reported study.</w:t>
-            </w:r>
-          </w:p>
-        </w:tc>
-        <w:tc>
-          <w:tcPr>
-            <w:tcW w:type="dxa" w:w="2556"/>
-          </w:tcPr>
-          <w:p>
-            <w:r>
-              <w:t>Ranks attributes by satisfaction, rather than individual capital interventions.</w:t>
-            </w:r>
-          </w:p>
-        </w:tc>
-      </w:tr>
-      <w:tr>
-        <w:trPr>
-          <w:cantSplit/>
-        </w:trPr>
-        <w:tc>
-          <w:tcPr>
-            <w:tcW w:type="dxa" w:w="2556"/>
-          </w:tcPr>
-          <w:p>
-            <w:r>
-              <w:t>Evaluating the Pedestrian Gap Acceptance in Semicontrolled Midblock Crosswalks with an Integrated AHP-FL Approach (2022), Journal of Transportation Engineering Part A 148(9); DOI 10.1061/JTEPBS.0000720</w:t>
-            </w:r>
-          </w:p>
-        </w:tc>
-        <w:tc>
-          <w:tcPr>
-            <w:tcW w:type="dxa" w:w="2556"/>
-          </w:tcPr>
-          <w:p>
-            <w:r>
-              <w:t>Gap-acceptance analysis with AHP and fuzzy logic</w:t>
-            </w:r>
-          </w:p>
-        </w:tc>
-        <w:tc>
-          <w:tcPr>
-            <w:tcW w:type="dxa" w:w="2556"/>
-          </w:tcPr>
-          <w:p>
-            <w:r>
-              <w:t>Supports fuzzy treatment of imprecise crossing-behaviour judgments.</w:t>
-            </w:r>
-          </w:p>
-        </w:tc>
-        <w:tc>
-          <w:tcPr>
-            <w:tcW w:type="dxa" w:w="2556"/>
-          </w:tcPr>
-          <w:p>
-            <w:r>
-              <w:t>Different outcome and integrated method; not fuzzy TOPSIS.</w:t>
-            </w:r>
-          </w:p>
-        </w:tc>
-      </w:tr>
-      <w:tr>
-        <w:trPr>
-          <w:cantSplit/>
-        </w:trPr>
-        <w:tc>
-          <w:tcPr>
-            <w:tcW w:type="dxa" w:w="2556"/>
-          </w:tcPr>
-          <w:p>
-            <w:r>
-              <w:t>Chen (2000), Extensions of the TOPSIS for group decision-making under fuzzy environment, Fuzzy Sets and Systems 114(1), 1–9</w:t>
-            </w:r>
-          </w:p>
-        </w:tc>
-        <w:tc>
-          <w:tcPr>
-            <w:tcW w:type="dxa" w:w="2556"/>
-          </w:tcPr>
-          <w:p>
-            <w:r>
-              <w:t>Triangular linguistic ratings; vertex distance and fuzzy ideals</w:t>
-            </w:r>
-          </w:p>
-        </w:tc>
-        <w:tc>
-          <w:tcPr>
-            <w:tcW w:type="dxa" w:w="2556"/>
-          </w:tcPr>
-          <w:p>
-            <w:r>
-              <w:t>Defines the fuzzy TOPSIS variant used here.</w:t>
-            </w:r>
-          </w:p>
-        </w:tc>
-        <w:tc>
-          <w:tcPr>
-            <w:tcW w:type="dxa" w:w="2556"/>
-          </w:tcPr>
-          <w:p>
-            <w:r>
-              <w:t>This project adapts its distance/closeness core to ranges in measured criteria; that adaptation is stated explicitly.</w:t>
+              <w:rPr>
+                <w:sz w:val="20"/>
+              </w:rPr>
+              <w:t>Motivates vertex distances and explicit sensitivity to representation choices.</w:t>
             </w:r>
           </w:p>
         </w:tc>
@@ -300,12 +354,7 @@
     </w:tbl>
     <w:p>
       <w:r>
-        <w:t>Jefmański and Sagan (2021) show that the choice of fuzzy conversion scale can materially change closeness values. This supports recording the evidence behind each triangular range and testing assumptions. It does not validate a particular scale for crossing audits; the proposed 0–3 rubric remains provisional.</w:t>
-      </w:r>
-    </w:p>
-    <w:p>
-      <w:r>
-        <w:t>FHWA guidance independently supports using pedestrian and vehicle volumes, crossing width and other variables when selecting treatments at unsignalized crossings; its thresholds are not transplanted to India. Visibility guidance identifies obstruction, lighting and roadway geometry as relevant visibility issues. Local engineering standards must determine which treatment is feasible.</w:t>
+        <w:t>The three transport studies address related decisions rather than providing local measurements. Chen [4] supplies the method lineage; this project does not claim an unchanged implementation of its group linguistic formulation. The full original paper was not accessible through the earlier open-source review. The declared project equations below therefore define the implemented model precisely. The open exposition in [5] also supports examining sensitivity to fuzzy conversion choices.</w:t>
       </w:r>
     </w:p>
     <w:p>
@@ -313,292 +362,324 @@
         <w:pStyle w:val="Heading1"/>
       </w:pPr>
       <w:r>
-        <w:t>3. Scope, criteria and collection</w:t>
+        <w:t>4 Criteria and data collection</w:t>
       </w:r>
     </w:p>
     <w:p>
       <w:r>
-        <w:t>Identify each candidate by GPS position, road approach, crossing ID, photo evidence and proposed action. Include only a package that addresses a documented deficiency and passes a preliminary feasibility review; retain rejected proposals with reasons. Count crossing pedestrians and motor vehicles in matched 15-minute windows, with at least three intervals in morning, midday and evening periods on two ordinary weekdays. Record date, time, weather, events, direction and observer. Two assessors independently audit access and control/visibility features, retaining component observations and photo IDs. Reconcile differences only with written evidence. The count minimum, median and maximum become the triangle; assessor ratings supply the audit range. This schedule is a proposed field protocol, not completed research.</w:t>
+        <w:t>All criteria increase priority. Table 2 defines the small baseline and its extension. Equal weights are a transparent starting point because no expert elicitation has occurred. Cost is excluded because no verified estimates exist. Feasibility is an inclusion gate, not an invented numerical benefit.</w:t>
       </w:r>
     </w:p>
     <w:tbl>
       <w:tblPr>
-        <w:tblStyle w:val="TableGrid"/>
+        <w:tblStyle w:val="LightShading-Accent1"/>
         <w:tblW w:type="auto" w:w="0"/>
         <w:tblLook w:firstColumn="1" w:firstRow="1" w:lastColumn="0" w:lastRow="0" w:noHBand="0" w:noVBand="1" w:val="04A0"/>
       </w:tblPr>
       <w:tblGrid>
-        <w:gridCol w:w="2556"/>
-        <w:gridCol w:w="2556"/>
-        <w:gridCol w:w="2556"/>
-        <w:gridCol w:w="2556"/>
+        <w:gridCol w:w="3250"/>
+        <w:gridCol w:w="3250"/>
+        <w:gridCol w:w="3250"/>
       </w:tblGrid>
       <w:tr>
         <w:trPr>
-          <w:cantSplit/>
+          <w:tblHeader/>
         </w:trPr>
         <w:tc>
           <w:tcPr>
-            <w:tcW w:type="dxa" w:w="2556"/>
+            <w:tcW w:type="dxa" w:w="3250"/>
           </w:tcPr>
           <w:p>
+            <w:pPr>
+              <w:spacing w:after="80"/>
+            </w:pPr>
             <w:r>
-              <w:t>Criterion</w:t>
+              <w:rPr>
+                <w:sz w:val="20"/>
+              </w:rPr>
+              <w:t>Code</w:t>
             </w:r>
           </w:p>
         </w:tc>
         <w:tc>
           <w:tcPr>
-            <w:tcW w:type="dxa" w:w="2556"/>
+            <w:tcW w:type="dxa" w:w="3250"/>
           </w:tcPr>
           <w:p>
+            <w:pPr>
+              <w:spacing w:after="80"/>
+            </w:pPr>
             <w:r>
-              <w:t>Operational definition / unit</w:t>
+              <w:rPr>
+                <w:sz w:val="20"/>
+              </w:rPr>
+              <w:t>Criterion and unit</w:t>
             </w:r>
           </w:p>
         </w:tc>
         <w:tc>
           <w:tcPr>
-            <w:tcW w:type="dxa" w:w="2556"/>
+            <w:tcW w:type="dxa" w:w="3250"/>
           </w:tcPr>
           <w:p>
+            <w:pPr>
+              <w:spacing w:after="80"/>
+            </w:pPr>
             <w:r>
-              <w:t>Direction and evidence</w:t>
+              <w:rPr>
+                <w:sz w:val="20"/>
+              </w:rPr>
+              <w:t>Evidence and uncertainty</w:t>
+            </w:r>
+          </w:p>
+        </w:tc>
+      </w:tr>
+      <w:tr>
+        <w:tc>
+          <w:tcPr>
+            <w:tcW w:type="dxa" w:w="3250"/>
+          </w:tcPr>
+          <w:p>
+            <w:pPr>
+              <w:spacing w:after="80"/>
+            </w:pPr>
+            <w:r>
+              <w:rPr>
+                <w:sz w:val="20"/>
+              </w:rPr>
+              <w:t>P1</w:t>
             </w:r>
           </w:p>
         </w:tc>
         <w:tc>
           <w:tcPr>
-            <w:tcW w:type="dxa" w:w="2556"/>
+            <w:tcW w:type="dxa" w:w="3250"/>
           </w:tcPr>
           <w:p>
+            <w:pPr>
+              <w:spacing w:after="80"/>
+            </w:pPr>
             <w:r>
-              <w:t>Uncertainty; overlap control</w:t>
+              <w:rPr>
+                <w:sz w:val="20"/>
+              </w:rPr>
+              <w:t>Pedestrian demand, persons/hour</w:t>
+            </w:r>
+          </w:p>
+        </w:tc>
+        <w:tc>
+          <w:tcPr>
+            <w:tcW w:type="dxa" w:w="3250"/>
+          </w:tcPr>
+          <w:p>
+            <w:pPr>
+              <w:spacing w:after="80"/>
+            </w:pPr>
+            <w:r>
+              <w:rPr>
+                <w:sz w:val="20"/>
+              </w:rPr>
+              <w:t>Repeated matched windows; minimum, median, maximum rates.</w:t>
             </w:r>
           </w:p>
         </w:tc>
       </w:tr>
       <w:tr>
-        <w:trPr>
-          <w:cantSplit/>
-        </w:trPr>
         <w:tc>
           <w:tcPr>
-            <w:tcW w:type="dxa" w:w="2556"/>
+            <w:tcW w:type="dxa" w:w="3250"/>
           </w:tcPr>
           <w:p>
+            <w:pPr>
+              <w:spacing w:after="80"/>
+            </w:pPr>
             <w:r>
-              <w:t>P1 Pedestrian demand</w:t>
+              <w:rPr>
+                <w:sz w:val="20"/>
+              </w:rPr>
+              <w:t>P2</w:t>
             </w:r>
           </w:p>
         </w:tc>
         <w:tc>
           <w:tcPr>
-            <w:tcW w:type="dxa" w:w="2556"/>
+            <w:tcW w:type="dxa" w:w="3250"/>
           </w:tcPr>
           <w:p>
+            <w:pPr>
+              <w:spacing w:after="80"/>
+            </w:pPr>
             <w:r>
-              <w:t>People crossing per hour; interval counts</w:t>
+              <w:rPr>
+                <w:sz w:val="20"/>
+              </w:rPr>
+              <w:t>Vehicle exposure, vehicles/hour</w:t>
             </w:r>
           </w:p>
         </w:tc>
         <w:tc>
           <w:tcPr>
-            <w:tcW w:type="dxa" w:w="2556"/>
+            <w:tcW w:type="dxa" w:w="3250"/>
           </w:tcPr>
           <w:p>
+            <w:pPr>
+              <w:spacing w:after="80"/>
+            </w:pPr>
             <w:r>
-              <w:t>Higher priority with more users; repeated manual counts</w:t>
+              <w:rPr>
+                <w:sz w:val="20"/>
+              </w:rPr>
+              <w:t>Same windows and approach; minimum, median, maximum rates.</w:t>
+            </w:r>
+          </w:p>
+        </w:tc>
+      </w:tr>
+      <w:tr>
+        <w:tc>
+          <w:tcPr>
+            <w:tcW w:type="dxa" w:w="3250"/>
+          </w:tcPr>
+          <w:p>
+            <w:pPr>
+              <w:spacing w:after="80"/>
+            </w:pPr>
+            <w:r>
+              <w:rPr>
+                <w:sz w:val="20"/>
+              </w:rPr>
+              <w:t>P3</w:t>
             </w:r>
           </w:p>
         </w:tc>
         <w:tc>
           <w:tcPr>
-            <w:tcW w:type="dxa" w:w="2556"/>
+            <w:tcW w:type="dxa" w:w="3250"/>
           </w:tcPr>
           <w:p>
+            <w:pPr>
+              <w:spacing w:after="80"/>
+            </w:pPr>
             <w:r>
-              <w:t>low/median/high from observed intervals; overlaps with destination counts, so destination criterion is access quality, not beneficiary count.</w:t>
+              <w:rPr>
+                <w:sz w:val="20"/>
+              </w:rPr>
+              <w:t>Accessibility deficiency, 0–3</w:t>
+            </w:r>
+          </w:p>
+        </w:tc>
+        <w:tc>
+          <w:tcPr>
+            <w:tcW w:type="dxa" w:w="3250"/>
+          </w:tcPr>
+          <w:p>
+            <w:pPr>
+              <w:spacing w:after="80"/>
+            </w:pPr>
+            <w:r>
+              <w:rPr>
+                <w:sz w:val="20"/>
+              </w:rPr>
+              <w:t>Independent photo-supported audits; documented rating range.</w:t>
             </w:r>
           </w:p>
         </w:tc>
       </w:tr>
       <w:tr>
-        <w:trPr>
-          <w:cantSplit/>
-        </w:trPr>
         <w:tc>
           <w:tcPr>
-            <w:tcW w:type="dxa" w:w="2556"/>
+            <w:tcW w:type="dxa" w:w="3250"/>
           </w:tcPr>
           <w:p>
+            <w:pPr>
+              <w:spacing w:after="80"/>
+            </w:pPr>
             <w:r>
-              <w:t>P2 Vehicle exposure</w:t>
+              <w:rPr>
+                <w:sz w:val="20"/>
+              </w:rPr>
+              <w:t>P4</w:t>
             </w:r>
           </w:p>
         </w:tc>
         <w:tc>
           <w:tcPr>
-            <w:tcW w:type="dxa" w:w="2556"/>
+            <w:tcW w:type="dxa" w:w="3250"/>
           </w:tcPr>
           <w:p>
+            <w:pPr>
+              <w:spacing w:after="80"/>
+            </w:pPr>
             <w:r>
-              <w:t>Vehicles passing per hour during same intervals</w:t>
+              <w:rPr>
+                <w:sz w:val="20"/>
+              </w:rPr>
+              <w:t>Control or visibility deficiency, 0–3</w:t>
             </w:r>
           </w:p>
         </w:tc>
         <w:tc>
           <w:tcPr>
-            <w:tcW w:type="dxa" w:w="2556"/>
+            <w:tcW w:type="dxa" w:w="3250"/>
           </w:tcPr>
           <w:p>
+            <w:pPr>
+              <w:spacing w:after="80"/>
+            </w:pPr>
             <w:r>
-              <w:t>Higher exposure raises priority; same count windows</w:t>
+              <w:rPr>
+                <w:sz w:val="20"/>
+              </w:rPr>
+              <w:t>Structured checklist; keep components distinct from P3.</w:t>
+            </w:r>
+          </w:p>
+        </w:tc>
+      </w:tr>
+      <w:tr>
+        <w:tc>
+          <w:tcPr>
+            <w:tcW w:type="dxa" w:w="3250"/>
+          </w:tcPr>
+          <w:p>
+            <w:pPr>
+              <w:spacing w:after="80"/>
+            </w:pPr>
+            <w:r>
+              <w:rPr>
+                <w:sz w:val="20"/>
+              </w:rPr>
+              <w:t>E1</w:t>
             </w:r>
           </w:p>
         </w:tc>
         <w:tc>
           <w:tcPr>
-            <w:tcW w:type="dxa" w:w="2556"/>
+            <w:tcW w:type="dxa" w:w="3250"/>
           </w:tcPr>
           <w:p>
+            <w:pPr>
+              <w:spacing w:after="80"/>
+            </w:pPr>
             <w:r>
-              <w:t>low/median/high across periods; related to P4 but represents exposure, not deficiency.</w:t>
-            </w:r>
-          </w:p>
-        </w:tc>
-      </w:tr>
-      <w:tr>
-        <w:trPr>
-          <w:cantSplit/>
-        </w:trPr>
-        <w:tc>
-          <w:tcPr>
-            <w:tcW w:type="dxa" w:w="2556"/>
-          </w:tcPr>
-          <w:p>
-            <w:r>
-              <w:t>P3 Accessibility deficiency</w:t>
+              <w:rPr>
+                <w:sz w:val="20"/>
+              </w:rPr>
+              <w:t>Essential-destination access, 0–3</w:t>
             </w:r>
           </w:p>
         </w:tc>
         <w:tc>
           <w:tcPr>
-            <w:tcW w:type="dxa" w:w="2556"/>
+            <w:tcW w:type="dxa" w:w="3250"/>
           </w:tcPr>
           <w:p>
+            <w:pPr>
+              <w:spacing w:after="80"/>
+            </w:pPr>
             <w:r>
-              <w:t>0–3 structured access audit: curb transition, ramp, tactile cue, clear path, approach continuity</w:t>
-            </w:r>
-          </w:p>
-        </w:tc>
-        <w:tc>
-          <w:tcPr>
-            <w:tcW w:type="dxa" w:w="2556"/>
-          </w:tcPr>
-          <w:p>
-            <w:r>
-              <w:t>Higher indicates more severe unmet access; paired audit and photos</w:t>
-            </w:r>
-          </w:p>
-        </w:tc>
-        <w:tc>
-          <w:tcPr>
-            <w:tcW w:type="dxa" w:w="2556"/>
-          </w:tcPr>
-          <w:p>
-            <w:r>
-              <w:t>range covers assessor disagreement; assess components and record evidence; no duplicate population criterion.</w:t>
-            </w:r>
-          </w:p>
-        </w:tc>
-      </w:tr>
-      <w:tr>
-        <w:trPr>
-          <w:cantSplit/>
-        </w:trPr>
-        <w:tc>
-          <w:tcPr>
-            <w:tcW w:type="dxa" w:w="2556"/>
-          </w:tcPr>
-          <w:p>
-            <w:r>
-              <w:t>P4 Safety-control / visibility deficiency</w:t>
-            </w:r>
-          </w:p>
-        </w:tc>
-        <w:tc>
-          <w:tcPr>
-            <w:tcW w:type="dxa" w:w="2556"/>
-          </w:tcPr>
-          <w:p>
-            <w:r>
-              <w:t>0–3 checklist of control appropriateness and observed sight/lighting/marking barriers</w:t>
-            </w:r>
-          </w:p>
-        </w:tc>
-        <w:tc>
-          <w:tcPr>
-            <w:tcW w:type="dxa" w:w="2556"/>
-          </w:tcPr>
-          <w:p>
-            <w:r>
-              <w:t>Higher indicates greater observed deficiency; paired audit</w:t>
-            </w:r>
-          </w:p>
-        </w:tc>
-        <w:tc>
-          <w:tcPr>
-            <w:tcW w:type="dxa" w:w="2556"/>
-          </w:tcPr>
-          <w:p>
-            <w:r>
-              <w:t>range from two assessors; keep distinct from traffic volume.</w:t>
-            </w:r>
-          </w:p>
-        </w:tc>
-      </w:tr>
-      <w:tr>
-        <w:trPr>
-          <w:cantSplit/>
-        </w:trPr>
-        <w:tc>
-          <w:tcPr>
-            <w:tcW w:type="dxa" w:w="2556"/>
-          </w:tcPr>
-          <w:p>
-            <w:r>
-              <w:t>E1 Essential-destination access (extension)</w:t>
-            </w:r>
-          </w:p>
-        </w:tc>
-        <w:tc>
-          <w:tcPr>
-            <w:tcW w:type="dxa" w:w="2556"/>
-          </w:tcPr>
-          <w:p>
-            <w:r>
-              <w:t>0–3 evidence-based access importance score from mapped essential destinations within predeclared walk-network catchment</w:t>
-            </w:r>
-          </w:p>
-        </w:tc>
-        <w:tc>
-          <w:tcPr>
-            <w:tcW w:type="dxa" w:w="2556"/>
-          </w:tcPr>
-          <w:p>
-            <w:r>
-              <w:t>Higher priority when a deficient crossing limits essential access; verified mapping and walk audit</w:t>
-            </w:r>
-          </w:p>
-        </w:tc>
-        <w:tc>
-          <w:tcPr>
-            <w:tcW w:type="dxa" w:w="2556"/>
-          </w:tcPr>
-          <w:p>
-            <w:r>
-              <w:t>paired classification range; do not use destination count if correlated with demand; publish catchment and list.</w:t>
+              <w:rPr>
+                <w:sz w:val="20"/>
+              </w:rPr>
+              <w:t>Verified routes, destination IDs and alternative-route evidence.</w:t>
             </w:r>
           </w:p>
         </w:tc>
@@ -606,12 +687,12 @@
     </w:tbl>
     <w:p>
       <w:r>
-        <w:t>The proposed rubric distinguishes no observed barrier (0), localized impairment (1), material obstruction or difficult detour (2), and an observed impassable approach or severe visible concern (3). For essential-destination access, the rating rises with the documented dependence of verified essential routes on the crossing. Component evidence, practical alternate routes and assessor disagreements must be recorded. The full provisional rubric is supplied separately for review before fieldwork.</w:t>
+        <w:t>The protocol proposes two ordinary weekdays, morning, midday and evening periods, and three 15-minute intervals per period. Counts become hourly rates using count × 60/minutes. Weather and disruptions are recorded; atypical sessions are repeated or analysed separately. Two assessors retain independent ratings and evidence IDs. Disagreement is preserved or adjudicated with a written reason. OpenStreetMap is a potential inventory aid [6], not a verified local dataset in this submission. No map extract, traffic counts or field photographs are included.</w:t>
       </w:r>
     </w:p>
     <w:p>
       <w:r>
-        <w:t>The 0–3 ratings are operational study definitions, not an Indian compliance scale. Applicable local design rules and the actual action package must be reviewed by engineers before an eligibility decision. OpenStreetMap is a possible source for network context and crossing identification, but no local extract was obtained; map completeness would require site verification. Missing values remain missing and trigger re-observation. Raw interval and paired-audit forms, a collated decision matrix template, data dictionary and source register accompany the report. Pedestrian volume and destination access may overlap, so the extension records the consequence of losing an essential route rather than repeating beneficiary counts.</w:t>
+        <w:br w:type="page"/>
       </w:r>
     </w:p>
     <w:p>
@@ -619,22 +700,42 @@
         <w:pStyle w:val="Heading1"/>
       </w:pPr>
       <w:r>
-        <w:t>4. Fuzzy TOPSIS model</w:t>
+        <w:t>5 Mathematical specification</w:t>
       </w:r>
     </w:p>
     <w:p>
       <w:r>
-        <w:t>For alternative i and criterion j, collect a triangle x̃ij=(l,c,u), with l≤c≤u. For counts, these are the minimum, median and maximum observed hourly rates; for paired audits, they are evidence-supported lower, central and upper ratings. These spreads describe observed variation or assessor disagreement. A triangular membership function is zero outside [l,u], rises as (x−l)/(c−l) to one at c, then falls as (u−x)/(u−c); degenerate shoulders use limiting conventions. Membership is graded compatibility with the imprecise rating, not probability. Choosing a triangular shape is a transparent approximation; it is not calibrated without additional observations.</w:t>
+        <w:t>For alternative i and criterion j, x̃ᵢⱼ = (lᵢⱼ, cᵢⱼ, uᵢⱼ), with l ≤ c ≤ u. For counts, the three values are the minimum, median and maximum observed hourly rates. For audits, they record the lower, central and upper documented ratings. The triangular shape is a modelling approximation: observed bounds alone do not establish that membership declines linearly. Temporal variation and assessor disagreement are different sources of imprecision and must remain identifiable in the underlying records.</w:t>
       </w:r>
     </w:p>
     <w:p>
       <w:r>
-        <w:t>All selected criteria increase priority. For each j set Lj=min_i lij and Uj=max_i uij, then normalize each triangle component q by zijq=(xijq−Lj)/(Uj−Lj). Remove a criterion that is constant or identical across alternatives and renormalize the remaining nonnegative weights to sum to one; use wj=1/m provisionally. Form vij=wjzij. The project’s attainable positive ideal is (wj,wj,wj) and its negative ideal is (0,0,0). With Chen’s vertex metric d(a,b)=sqrt{[(al−bl)²+(ac−bc)²+(au−bu)²]/3}, sum criterion distances: Di+=Σj d(vij,Aj+) and Di−=Σj d(vij,Aj−). Closeness is Ci=Di−/(Di++Di−), ranked in descending order. The weighted ideals and observed-range normalization are explicit project adaptations to crisp weights and measured data; they are not presented as unchanged elements of Chen’s group linguistic-rating example.</w:t>
+        <w:t>For a nondegenerate triangle (l,c,u), membership is zero outside [l,u], rises as (x−l)/(c−l) from l to c, equals one at c, and falls as (u−x)/(u−c) from c to u. A hypothetical triangle (100,120,160) has membership 0.5 at 110 and 140 and membership 1 at 120. These grades are not probabilities. When l=c or c=u, the corresponding rising or falling segment is absent; a fully crisp triple concentrates at its one value.</w:t>
       </w:r>
     </w:p>
     <w:p>
       <w:r>
-        <w:t>The implementation rejects unordered or nonfinite triangles, negative measurements, invalid weights, duplicate alternative IDs and zero denominators. An alternative set with no discriminating criterion cannot be ranked. Scaling bounds depend on the included candidates, so closeness scores are relative to that set. A cost criterion, if introduced later, must be reverse-oriented before this benefit-only model is used. Engineering feasibility is screened before ranking, while cost and budget constraints need a separate allocation decision.</w:t>
+        <w:t>Shared outer bounds are Lⱼ = minᵢ lᵢⱼ and Uⱼ = maxᵢ uᵢⱼ. Each component q is normalised by zᵢⱼq = (xᵢⱼq−Lⱼ)/(Uⱼ−Lⱼ). Identical criterion triples across alternatives are excluded, including zero-range criteria. The remaining weights are renormalised. This avoids division by zero and prevents a non-discriminating criterion changing the score. All included criteria are priority-oriented, so no cost reversal is applied.</w:t>
+      </w:r>
+    </w:p>
+    <w:p>
+      <w:r>
+        <w:t>With m active criteria, wⱼ = 1/m initially. Form the weighted triangle ṽᵢⱼ = wⱼz̃ᵢⱼ. The positive ideal is Aⱼ⁺ = (wⱼ,wⱼ,wⱼ), and the negative ideal is Aⱼ⁻ = (0,0,0). These are theoretical corners of the weighted scale; they need not be observed packages. The normalisation, crisp weights and weighted ideals are explicit project adaptations, while the vertex metric and distance summation retain the Chen-style structure.</w:t>
+      </w:r>
+    </w:p>
+    <w:p>
+      <w:r>
+        <w:t>d(ã,b̃) = √[((aₗ−bₗ)² + (a꜀−b꜀)² + (aᵤ−bᵤ)²)/3]</w:t>
+      </w:r>
+    </w:p>
+    <w:p>
+      <w:r>
+        <w:t>Dᵢ⁺ = Σⱼ d(ṽᵢⱼ,Aⱼ⁺);     Dᵢ⁻ = Σⱼ d(ṽᵢⱼ,Aⱼ⁻);     Cᵢ = Dᵢ⁻/(Dᵢ⁺+Dᵢ⁻).</w:t>
+      </w:r>
+    </w:p>
+    <w:p>
+      <w:r>
+        <w:t>Rank Cᵢ in descending order. Larger scores mean closer to the high-priority ideal relative to the low-priority ideal. A zero denominator is rejected. Exact equal scores receive the same minimum rank; alternative IDs determine display order. The program exports each normalised triple, active weight and criterion distance, so every total can be reconstructed. Appendix A independently checks a two-criterion example.</w:t>
       </w:r>
     </w:p>
     <w:p>
@@ -642,17 +743,206 @@
         <w:pStyle w:val="Heading1"/>
       </w:pPr>
       <w:r>
-        <w:t>5. Extension and evaluation plan</w:t>
+        <w:t>6 Processing workflow and comparison design</w:t>
       </w:r>
     </w:p>
     <w:p>
       <w:r>
-        <w:t>The extension adds E1, a 0–3 assessment of access to independently verified essential destinations through the crossing. Its walking-network catchment, destination list and alternative route evidence must be documented before scoring. Compare the same candidate set under P1–P4 and P1–P4+E1, with equal weights renormalized within each model. Compare fuzzy TOPSIS with a transparent crisp baseline: the equal-weight mean after a separate criterion-wise min–max normalization of central observations, omitting constant criteria. Report top-one change, top-three overlap and Spearman rank correlation. For weight sensitivity, multiply each equal weight by a sampled factor in [0.8,1.2], renormalize, and repeat 1,000 times with a recorded seed. Report how often each alternative ranks first and the top-three overlap. These measures describe model sensitivity, not validity. Independent validation requires a separate site audit or blinded engineering/accessibility review; none has yet been conducted.</w:t>
+        <w:t>Figure 1. Reproducible workflow</w:t>
+      </w:r>
+    </w:p>
+    <w:tbl>
+      <w:tblPr>
+        <w:tblStyle w:val="LightShading-Accent1"/>
+        <w:tblW w:type="auto" w:w="0"/>
+        <w:tblLook w:firstColumn="1" w:firstRow="1" w:lastColumn="0" w:lastRow="0" w:noHBand="0" w:noVBand="1" w:val="04A0"/>
+      </w:tblPr>
+      <w:tblGrid>
+        <w:gridCol w:w="4874"/>
+        <w:gridCol w:w="4874"/>
+      </w:tblGrid>
+      <w:tr>
+        <w:trPr>
+          <w:tblHeader/>
+        </w:trPr>
+        <w:tc>
+          <w:tcPr>
+            <w:tcW w:type="dxa" w:w="4874"/>
+          </w:tcPr>
+          <w:p>
+            <w:pPr>
+              <w:spacing w:after="80"/>
+            </w:pPr>
+            <w:r>
+              <w:rPr>
+                <w:sz w:val="20"/>
+              </w:rPr>
+              <w:t>Stage</w:t>
+            </w:r>
+          </w:p>
+        </w:tc>
+        <w:tc>
+          <w:tcPr>
+            <w:tcW w:type="dxa" w:w="4874"/>
+          </w:tcPr>
+          <w:p>
+            <w:pPr>
+              <w:spacing w:after="80"/>
+            </w:pPr>
+            <w:r>
+              <w:rPr>
+                <w:sz w:val="20"/>
+              </w:rPr>
+              <w:t>Output</w:t>
+            </w:r>
+          </w:p>
+        </w:tc>
+      </w:tr>
+      <w:tr>
+        <w:tc>
+          <w:tcPr>
+            <w:tcW w:type="dxa" w:w="4874"/>
+          </w:tcPr>
+          <w:p>
+            <w:pPr>
+              <w:spacing w:after="80"/>
+            </w:pPr>
+            <w:r>
+              <w:rPr>
+                <w:sz w:val="20"/>
+              </w:rPr>
+              <w:t>Inventory and evidence → feasibility gate</w:t>
+            </w:r>
+          </w:p>
+        </w:tc>
+        <w:tc>
+          <w:tcPr>
+            <w:tcW w:type="dxa" w:w="4874"/>
+          </w:tcPr>
+          <w:p>
+            <w:pPr>
+              <w:spacing w:after="80"/>
+            </w:pPr>
+            <w:r>
+              <w:rPr>
+                <w:sz w:val="20"/>
+              </w:rPr>
+              <w:t>Eligible packages and retained rejection reasons</w:t>
+            </w:r>
+          </w:p>
+        </w:tc>
+      </w:tr>
+      <w:tr>
+        <w:tc>
+          <w:tcPr>
+            <w:tcW w:type="dxa" w:w="4874"/>
+          </w:tcPr>
+          <w:p>
+            <w:pPr>
+              <w:spacing w:after="80"/>
+            </w:pPr>
+            <w:r>
+              <w:rPr>
+                <w:sz w:val="20"/>
+              </w:rPr>
+              <w:t>Validate → derive triples → normalise</w:t>
+            </w:r>
+          </w:p>
+        </w:tc>
+        <w:tc>
+          <w:tcPr>
+            <w:tcW w:type="dxa" w:w="4874"/>
+          </w:tcPr>
+          <w:p>
+            <w:pPr>
+              <w:spacing w:after="80"/>
+            </w:pPr>
+            <w:r>
+              <w:rPr>
+                <w:sz w:val="20"/>
+              </w:rPr>
+              <w:t>Clean matrix and preprocessing log</w:t>
+            </w:r>
+          </w:p>
+        </w:tc>
+      </w:tr>
+      <w:tr>
+        <w:tc>
+          <w:tcPr>
+            <w:tcW w:type="dxa" w:w="4874"/>
+          </w:tcPr>
+          <w:p>
+            <w:pPr>
+              <w:spacing w:after="80"/>
+            </w:pPr>
+            <w:r>
+              <w:rPr>
+                <w:sz w:val="20"/>
+              </w:rPr>
+              <w:t>Weight → calculate distances → rank</w:t>
+            </w:r>
+          </w:p>
+        </w:tc>
+        <w:tc>
+          <w:tcPr>
+            <w:tcW w:type="dxa" w:w="4874"/>
+          </w:tcPr>
+          <w:p>
+            <w:pPr>
+              <w:spacing w:after="80"/>
+            </w:pPr>
+            <w:r>
+              <w:rPr>
+                <w:sz w:val="20"/>
+              </w:rPr>
+              <w:t>Scores and criterion calculation trace</w:t>
+            </w:r>
+          </w:p>
+        </w:tc>
+      </w:tr>
+      <w:tr>
+        <w:tc>
+          <w:tcPr>
+            <w:tcW w:type="dxa" w:w="4874"/>
+          </w:tcPr>
+          <w:p>
+            <w:pPr>
+              <w:spacing w:after="80"/>
+            </w:pPr>
+            <w:r>
+              <w:rPr>
+                <w:sz w:val="20"/>
+              </w:rPr>
+              <w:t>Compare → perturb assumptions → human review</w:t>
+            </w:r>
+          </w:p>
+        </w:tc>
+        <w:tc>
+          <w:tcPr>
+            <w:tcW w:type="dxa" w:w="4874"/>
+          </w:tcPr>
+          <w:p>
+            <w:pPr>
+              <w:spacing w:after="80"/>
+            </w:pPr>
+            <w:r>
+              <w:rPr>
+                <w:sz w:val="20"/>
+              </w:rPr>
+              <w:t>Evaluation tables, chart and review priorities</w:t>
+            </w:r>
+          </w:p>
+        </w:tc>
+      </w:tr>
+    </w:tbl>
+    <w:p>
+      <w:r>
+        <w:t>The crisp comparator min–max scales central observations separately and averages active columns. The extension adds E1 at weight 1/5 and assigns each original criterion 1/5, preserving their relative weights. It asks about the effect of adding access importance; it is not a controlled test of predictive accuracy. Correlations among central criteria flag possible overlap, but four invented rows cannot establish independence or justify deleting a criterion.</w:t>
       </w:r>
     </w:p>
     <w:p>
       <w:r>
-        <w:t>Interpret the output as a screening order for technical review. Verify treatment appropriateness, dependencies, costs and budget fit separately; a rank ordering does not solve a budget-constrained portfolio problem. Do not infer crash reduction without an appropriate causal evaluation.</w:t>
+        <w:br w:type="page"/>
       </w:r>
     </w:p>
     <w:p>
@@ -660,17 +950,673 @@
         <w:pStyle w:val="Heading1"/>
       </w:pPr>
       <w:r>
-        <w:t>6. Implementation, reproducibility and current result status</w:t>
+        <w:t>7 Implementation and hypothetical evaluation</w:t>
       </w:r>
     </w:p>
     <w:p>
       <w:r>
-        <w:t>The Python pipeline accepts a completed collated field CSV, validates numeric ranges and record identifiers, excludes documented infeasible candidates, saves a clean matrix and processing log, and writes the fuzzy baseline, crisp comparison, destination extension, sensitivity tables and an SVG chart. It was executed on a separately labelled synthetic dataset only. Five test cases passed, covering a hand-calculated two-criterion result, constant-criterion invariance, benefit/cost orientation, invalid data and end-to-end output. No actual crossing ranking, real-world sensitivity conclusion, extension benefit or independent validation can be reported from the supplied evidence. The exact commands and file schemas are in the README.</w:t>
+        <w:t>The Python pipeline validates required metadata, unique identifiers, ordered finite nonnegative triples, survey-date format and the 0–3 audit limits. It rejects missing measurements instead of replacing them with zero. Eight automated tests cover independent arithmetic, constant criteria, orientation, invalid data, duplicate identifiers, large weights and the evaluation exports. The run manifest records the input SHA-256 hash, runtime versions, seed and experiment settings. Input provenance and photograph authenticity still require human review.</w:t>
       </w:r>
     </w:p>
     <w:p>
       <w:r>
-        <w:t>The contribution is a transparent, priority-oriented adaptation of fuzzy TOPSIS for crossing-upgrade packages, a field protocol tying fuzzy spreads to observed variation, and a matched test of essential-destination access. Chen’s 2000 method supplies the vertex-distance and closeness core. The project’s crisp weights, outer-bound normalization and weighted ideals are documented choices rather than claims about the original paper. Separate mathematical checks and reproducible output files allow these choices to be challenged in a viva.</w:t>
+        <w:t>Table 3. Synthetic demonstration only; no actual crossing observations</w:t>
+      </w:r>
+    </w:p>
+    <w:tbl>
+      <w:tblPr>
+        <w:tblStyle w:val="LightShading-Accent1"/>
+        <w:tblW w:type="auto" w:w="0"/>
+        <w:tblLook w:firstColumn="1" w:firstRow="1" w:lastColumn="0" w:lastRow="0" w:noHBand="0" w:noVBand="1" w:val="04A0"/>
+      </w:tblPr>
+      <w:tblGrid>
+        <w:gridCol w:w="1950"/>
+        <w:gridCol w:w="1950"/>
+        <w:gridCol w:w="1950"/>
+        <w:gridCol w:w="1950"/>
+        <w:gridCol w:w="1950"/>
+      </w:tblGrid>
+      <w:tr>
+        <w:trPr>
+          <w:tblHeader/>
+        </w:trPr>
+        <w:tc>
+          <w:tcPr>
+            <w:tcW w:type="dxa" w:w="1950"/>
+          </w:tcPr>
+          <w:p>
+            <w:pPr>
+              <w:spacing w:after="80"/>
+            </w:pPr>
+            <w:r>
+              <w:rPr>
+                <w:sz w:val="20"/>
+              </w:rPr>
+              <w:t>Alternative</w:t>
+            </w:r>
+          </w:p>
+        </w:tc>
+        <w:tc>
+          <w:tcPr>
+            <w:tcW w:type="dxa" w:w="1950"/>
+          </w:tcPr>
+          <w:p>
+            <w:pPr>
+              <w:spacing w:after="80"/>
+            </w:pPr>
+            <w:r>
+              <w:rPr>
+                <w:sz w:val="20"/>
+              </w:rPr>
+              <w:t>Base score</w:t>
+            </w:r>
+          </w:p>
+        </w:tc>
+        <w:tc>
+          <w:tcPr>
+            <w:tcW w:type="dxa" w:w="1950"/>
+          </w:tcPr>
+          <w:p>
+            <w:pPr>
+              <w:spacing w:after="80"/>
+            </w:pPr>
+            <w:r>
+              <w:rPr>
+                <w:sz w:val="20"/>
+              </w:rPr>
+              <w:t>Base rank</w:t>
+            </w:r>
+          </w:p>
+        </w:tc>
+        <w:tc>
+          <w:tcPr>
+            <w:tcW w:type="dxa" w:w="1950"/>
+          </w:tcPr>
+          <w:p>
+            <w:pPr>
+              <w:spacing w:after="80"/>
+            </w:pPr>
+            <w:r>
+              <w:rPr>
+                <w:sz w:val="20"/>
+              </w:rPr>
+              <w:t>Crisp rank</w:t>
+            </w:r>
+          </w:p>
+        </w:tc>
+        <w:tc>
+          <w:tcPr>
+            <w:tcW w:type="dxa" w:w="1950"/>
+          </w:tcPr>
+          <w:p>
+            <w:pPr>
+              <w:spacing w:after="80"/>
+            </w:pPr>
+            <w:r>
+              <w:rPr>
+                <w:sz w:val="20"/>
+              </w:rPr>
+              <w:t>Extended rank</w:t>
+            </w:r>
+          </w:p>
+        </w:tc>
+      </w:tr>
+      <w:tr>
+        <w:tc>
+          <w:tcPr>
+            <w:tcW w:type="dxa" w:w="1950"/>
+          </w:tcPr>
+          <w:p>
+            <w:pPr>
+              <w:spacing w:after="80"/>
+            </w:pPr>
+            <w:r>
+              <w:rPr>
+                <w:sz w:val="20"/>
+              </w:rPr>
+              <w:t>HYP-A</w:t>
+            </w:r>
+          </w:p>
+        </w:tc>
+        <w:tc>
+          <w:tcPr>
+            <w:tcW w:type="dxa" w:w="1950"/>
+          </w:tcPr>
+          <w:p>
+            <w:pPr>
+              <w:spacing w:after="80"/>
+            </w:pPr>
+            <w:r>
+              <w:rPr>
+                <w:sz w:val="20"/>
+              </w:rPr>
+              <w:t>0.595646</w:t>
+            </w:r>
+          </w:p>
+        </w:tc>
+        <w:tc>
+          <w:tcPr>
+            <w:tcW w:type="dxa" w:w="1950"/>
+          </w:tcPr>
+          <w:p>
+            <w:pPr>
+              <w:spacing w:after="80"/>
+            </w:pPr>
+            <w:r>
+              <w:rPr>
+                <w:sz w:val="20"/>
+              </w:rPr>
+              <w:t>1</w:t>
+            </w:r>
+          </w:p>
+        </w:tc>
+        <w:tc>
+          <w:tcPr>
+            <w:tcW w:type="dxa" w:w="1950"/>
+          </w:tcPr>
+          <w:p>
+            <w:pPr>
+              <w:spacing w:after="80"/>
+            </w:pPr>
+            <w:r>
+              <w:rPr>
+                <w:sz w:val="20"/>
+              </w:rPr>
+              <w:t>1</w:t>
+            </w:r>
+          </w:p>
+        </w:tc>
+        <w:tc>
+          <w:tcPr>
+            <w:tcW w:type="dxa" w:w="1950"/>
+          </w:tcPr>
+          <w:p>
+            <w:pPr>
+              <w:spacing w:after="80"/>
+            </w:pPr>
+            <w:r>
+              <w:rPr>
+                <w:sz w:val="20"/>
+              </w:rPr>
+              <w:t>2</w:t>
+            </w:r>
+          </w:p>
+        </w:tc>
+      </w:tr>
+      <w:tr>
+        <w:tc>
+          <w:tcPr>
+            <w:tcW w:type="dxa" w:w="1950"/>
+          </w:tcPr>
+          <w:p>
+            <w:pPr>
+              <w:spacing w:after="80"/>
+            </w:pPr>
+            <w:r>
+              <w:rPr>
+                <w:sz w:val="20"/>
+              </w:rPr>
+              <w:t>HYP-B</w:t>
+            </w:r>
+          </w:p>
+        </w:tc>
+        <w:tc>
+          <w:tcPr>
+            <w:tcW w:type="dxa" w:w="1950"/>
+          </w:tcPr>
+          <w:p>
+            <w:pPr>
+              <w:spacing w:after="80"/>
+            </w:pPr>
+            <w:r>
+              <w:rPr>
+                <w:sz w:val="20"/>
+              </w:rPr>
+              <w:t>0.561219</w:t>
+            </w:r>
+          </w:p>
+        </w:tc>
+        <w:tc>
+          <w:tcPr>
+            <w:tcW w:type="dxa" w:w="1950"/>
+          </w:tcPr>
+          <w:p>
+            <w:pPr>
+              <w:spacing w:after="80"/>
+            </w:pPr>
+            <w:r>
+              <w:rPr>
+                <w:sz w:val="20"/>
+              </w:rPr>
+              <w:t>2</w:t>
+            </w:r>
+          </w:p>
+        </w:tc>
+        <w:tc>
+          <w:tcPr>
+            <w:tcW w:type="dxa" w:w="1950"/>
+          </w:tcPr>
+          <w:p>
+            <w:pPr>
+              <w:spacing w:after="80"/>
+            </w:pPr>
+            <w:r>
+              <w:rPr>
+                <w:sz w:val="20"/>
+              </w:rPr>
+              <w:t>2</w:t>
+            </w:r>
+          </w:p>
+        </w:tc>
+        <w:tc>
+          <w:tcPr>
+            <w:tcW w:type="dxa" w:w="1950"/>
+          </w:tcPr>
+          <w:p>
+            <w:pPr>
+              <w:spacing w:after="80"/>
+            </w:pPr>
+            <w:r>
+              <w:rPr>
+                <w:sz w:val="20"/>
+              </w:rPr>
+              <w:t>3</w:t>
+            </w:r>
+          </w:p>
+        </w:tc>
+      </w:tr>
+      <w:tr>
+        <w:tc>
+          <w:tcPr>
+            <w:tcW w:type="dxa" w:w="1950"/>
+          </w:tcPr>
+          <w:p>
+            <w:pPr>
+              <w:spacing w:after="80"/>
+            </w:pPr>
+            <w:r>
+              <w:rPr>
+                <w:sz w:val="20"/>
+              </w:rPr>
+              <w:t>HYP-D</w:t>
+            </w:r>
+          </w:p>
+        </w:tc>
+        <w:tc>
+          <w:tcPr>
+            <w:tcW w:type="dxa" w:w="1950"/>
+          </w:tcPr>
+          <w:p>
+            <w:pPr>
+              <w:spacing w:after="80"/>
+            </w:pPr>
+            <w:r>
+              <w:rPr>
+                <w:sz w:val="20"/>
+              </w:rPr>
+              <w:t>0.559763</w:t>
+            </w:r>
+          </w:p>
+        </w:tc>
+        <w:tc>
+          <w:tcPr>
+            <w:tcW w:type="dxa" w:w="1950"/>
+          </w:tcPr>
+          <w:p>
+            <w:pPr>
+              <w:spacing w:after="80"/>
+            </w:pPr>
+            <w:r>
+              <w:rPr>
+                <w:sz w:val="20"/>
+              </w:rPr>
+              <w:t>3</w:t>
+            </w:r>
+          </w:p>
+        </w:tc>
+        <w:tc>
+          <w:tcPr>
+            <w:tcW w:type="dxa" w:w="1950"/>
+          </w:tcPr>
+          <w:p>
+            <w:pPr>
+              <w:spacing w:after="80"/>
+            </w:pPr>
+            <w:r>
+              <w:rPr>
+                <w:sz w:val="20"/>
+              </w:rPr>
+              <w:t>4</w:t>
+            </w:r>
+          </w:p>
+        </w:tc>
+        <w:tc>
+          <w:tcPr>
+            <w:tcW w:type="dxa" w:w="1950"/>
+          </w:tcPr>
+          <w:p>
+            <w:pPr>
+              <w:spacing w:after="80"/>
+            </w:pPr>
+            <w:r>
+              <w:rPr>
+                <w:sz w:val="20"/>
+              </w:rPr>
+              <w:t>4</w:t>
+            </w:r>
+          </w:p>
+        </w:tc>
+      </w:tr>
+      <w:tr>
+        <w:tc>
+          <w:tcPr>
+            <w:tcW w:type="dxa" w:w="1950"/>
+          </w:tcPr>
+          <w:p>
+            <w:pPr>
+              <w:spacing w:after="80"/>
+            </w:pPr>
+            <w:r>
+              <w:rPr>
+                <w:sz w:val="20"/>
+              </w:rPr>
+              <w:t>HYP-C</w:t>
+            </w:r>
+          </w:p>
+        </w:tc>
+        <w:tc>
+          <w:tcPr>
+            <w:tcW w:type="dxa" w:w="1950"/>
+          </w:tcPr>
+          <w:p>
+            <w:pPr>
+              <w:spacing w:after="80"/>
+            </w:pPr>
+            <w:r>
+              <w:rPr>
+                <w:sz w:val="20"/>
+              </w:rPr>
+              <w:t>0.505106</w:t>
+            </w:r>
+          </w:p>
+        </w:tc>
+        <w:tc>
+          <w:tcPr>
+            <w:tcW w:type="dxa" w:w="1950"/>
+          </w:tcPr>
+          <w:p>
+            <w:pPr>
+              <w:spacing w:after="80"/>
+            </w:pPr>
+            <w:r>
+              <w:rPr>
+                <w:sz w:val="20"/>
+              </w:rPr>
+              <w:t>4</w:t>
+            </w:r>
+          </w:p>
+        </w:tc>
+        <w:tc>
+          <w:tcPr>
+            <w:tcW w:type="dxa" w:w="1950"/>
+          </w:tcPr>
+          <w:p>
+            <w:pPr>
+              <w:spacing w:after="80"/>
+            </w:pPr>
+            <w:r>
+              <w:rPr>
+                <w:sz w:val="20"/>
+              </w:rPr>
+              <w:t>2</w:t>
+            </w:r>
+          </w:p>
+        </w:tc>
+        <w:tc>
+          <w:tcPr>
+            <w:tcW w:type="dxa" w:w="1950"/>
+          </w:tcPr>
+          <w:p>
+            <w:pPr>
+              <w:spacing w:after="80"/>
+            </w:pPr>
+            <w:r>
+              <w:rPr>
+                <w:sz w:val="20"/>
+              </w:rPr>
+              <w:t>1</w:t>
+            </w:r>
+          </w:p>
+        </w:tc>
+      </w:tr>
+    </w:tbl>
+    <w:p>
+      <w:r>
+        <w:t>HYP-A leads the four-criterion fuzzy model. HYP-B and HYP-D differ by only about 0.00146, which is too small to treat as a substantive field conclusion even if the inputs were observed. HYP-C moves from fourth to first when destination access is introduced. This reversal illustrates the question being tested: local deficiency and demand can yield a different ordering from a model that also values access consequences. No improvement in safety or decision quality follows from this numerical change alone.</w:t>
+      </w:r>
+    </w:p>
+    <w:p>
+      <w:r>
+        <w:t>Table 4. Comparison of rankings on the same hypothetical alternatives</w:t>
+      </w:r>
+    </w:p>
+    <w:tbl>
+      <w:tblPr>
+        <w:tblStyle w:val="LightShading-Accent1"/>
+        <w:tblW w:type="auto" w:w="0"/>
+        <w:tblLook w:firstColumn="1" w:firstRow="1" w:lastColumn="0" w:lastRow="0" w:noHBand="0" w:noVBand="1" w:val="04A0"/>
+      </w:tblPr>
+      <w:tblGrid>
+        <w:gridCol w:w="2437"/>
+        <w:gridCol w:w="2437"/>
+        <w:gridCol w:w="2437"/>
+        <w:gridCol w:w="2437"/>
+      </w:tblGrid>
+      <w:tr>
+        <w:trPr>
+          <w:tblHeader/>
+        </w:trPr>
+        <w:tc>
+          <w:tcPr>
+            <w:tcW w:type="dxa" w:w="2437"/>
+          </w:tcPr>
+          <w:p>
+            <w:pPr>
+              <w:spacing w:after="80"/>
+            </w:pPr>
+            <w:r>
+              <w:rPr>
+                <w:sz w:val="20"/>
+              </w:rPr>
+              <w:t>Comparison</w:t>
+            </w:r>
+          </w:p>
+        </w:tc>
+        <w:tc>
+          <w:tcPr>
+            <w:tcW w:type="dxa" w:w="2437"/>
+          </w:tcPr>
+          <w:p>
+            <w:pPr>
+              <w:spacing w:after="80"/>
+            </w:pPr>
+            <w:r>
+              <w:rPr>
+                <w:sz w:val="20"/>
+              </w:rPr>
+              <w:t>Top choice changes</w:t>
+            </w:r>
+          </w:p>
+        </w:tc>
+        <w:tc>
+          <w:tcPr>
+            <w:tcW w:type="dxa" w:w="2437"/>
+          </w:tcPr>
+          <w:p>
+            <w:pPr>
+              <w:spacing w:after="80"/>
+            </w:pPr>
+            <w:r>
+              <w:rPr>
+                <w:sz w:val="20"/>
+              </w:rPr>
+              <w:t>Top-three overlap</w:t>
+            </w:r>
+          </w:p>
+        </w:tc>
+        <w:tc>
+          <w:tcPr>
+            <w:tcW w:type="dxa" w:w="2437"/>
+          </w:tcPr>
+          <w:p>
+            <w:pPr>
+              <w:spacing w:after="80"/>
+            </w:pPr>
+            <w:r>
+              <w:rPr>
+                <w:sz w:val="20"/>
+              </w:rPr>
+              <w:t>Spearman</w:t>
+            </w:r>
+          </w:p>
+        </w:tc>
+      </w:tr>
+      <w:tr>
+        <w:tc>
+          <w:tcPr>
+            <w:tcW w:type="dxa" w:w="2437"/>
+          </w:tcPr>
+          <w:p>
+            <w:pPr>
+              <w:spacing w:after="80"/>
+            </w:pPr>
+            <w:r>
+              <w:rPr>
+                <w:sz w:val="20"/>
+              </w:rPr>
+              <w:t>base vs crisp</w:t>
+            </w:r>
+          </w:p>
+        </w:tc>
+        <w:tc>
+          <w:tcPr>
+            <w:tcW w:type="dxa" w:w="2437"/>
+          </w:tcPr>
+          <w:p>
+            <w:pPr>
+              <w:spacing w:after="80"/>
+            </w:pPr>
+            <w:r>
+              <w:rPr>
+                <w:sz w:val="20"/>
+              </w:rPr>
+              <w:t>False</w:t>
+            </w:r>
+          </w:p>
+        </w:tc>
+        <w:tc>
+          <w:tcPr>
+            <w:tcW w:type="dxa" w:w="2437"/>
+          </w:tcPr>
+          <w:p>
+            <w:pPr>
+              <w:spacing w:after="80"/>
+            </w:pPr>
+            <w:r>
+              <w:rPr>
+                <w:sz w:val="20"/>
+              </w:rPr>
+              <w:t>0.667</w:t>
+            </w:r>
+          </w:p>
+        </w:tc>
+        <w:tc>
+          <w:tcPr>
+            <w:tcW w:type="dxa" w:w="2437"/>
+          </w:tcPr>
+          <w:p>
+            <w:pPr>
+              <w:spacing w:after="80"/>
+            </w:pPr>
+            <w:r>
+              <w:rPr>
+                <w:sz w:val="20"/>
+              </w:rPr>
+              <w:t>0.632</w:t>
+            </w:r>
+          </w:p>
+        </w:tc>
+      </w:tr>
+      <w:tr>
+        <w:tc>
+          <w:tcPr>
+            <w:tcW w:type="dxa" w:w="2437"/>
+          </w:tcPr>
+          <w:p>
+            <w:pPr>
+              <w:spacing w:after="80"/>
+            </w:pPr>
+            <w:r>
+              <w:rPr>
+                <w:sz w:val="20"/>
+              </w:rPr>
+              <w:t>base vs extension</w:t>
+            </w:r>
+          </w:p>
+        </w:tc>
+        <w:tc>
+          <w:tcPr>
+            <w:tcW w:type="dxa" w:w="2437"/>
+          </w:tcPr>
+          <w:p>
+            <w:pPr>
+              <w:spacing w:after="80"/>
+            </w:pPr>
+            <w:r>
+              <w:rPr>
+                <w:sz w:val="20"/>
+              </w:rPr>
+              <w:t>True</w:t>
+            </w:r>
+          </w:p>
+        </w:tc>
+        <w:tc>
+          <w:tcPr>
+            <w:tcW w:type="dxa" w:w="2437"/>
+          </w:tcPr>
+          <w:p>
+            <w:pPr>
+              <w:spacing w:after="80"/>
+            </w:pPr>
+            <w:r>
+              <w:rPr>
+                <w:sz w:val="20"/>
+              </w:rPr>
+              <w:t>0.667</w:t>
+            </w:r>
+          </w:p>
+        </w:tc>
+        <w:tc>
+          <w:tcPr>
+            <w:tcW w:type="dxa" w:w="2437"/>
+          </w:tcPr>
+          <w:p>
+            <w:pPr>
+              <w:spacing w:after="80"/>
+            </w:pPr>
+            <w:r>
+              <w:rPr>
+                <w:sz w:val="20"/>
+              </w:rPr>
+              <w:t>-0.200</w:t>
+            </w:r>
+          </w:p>
+        </w:tc>
+      </w:tr>
+    </w:tbl>
+    <w:p>
+      <w:r>
+        <w:t>Spearman is correlation between average ranks and describes ordering agreement. Top-three overlap is the shared number of selected alternatives divided by three. Exact ties use ID order for selection statistics; this arbitrary boundary choice must be checked when ties occur. Neither agreement nor disagreement validates the ranking against a real outcome. The crisp comparison changes both fuzzy representation and scaling, so it cannot isolate the effect of uncertainty alone.</w:t>
       </w:r>
     </w:p>
     <w:p>
@@ -678,12 +1624,86 @@
         <w:pStyle w:val="Heading1"/>
       </w:pPr>
       <w:r>
-        <w:t>7. Limitations and conclusion</w:t>
+        <w:t>8 Sensitivity to weights and uncertainty</w:t>
       </w:r>
     </w:p>
     <w:p>
       <w:r>
-        <w:t>No site inventory, repeated counts, paired audit, destination mapping, cost estimates or feasibility approvals were supplied. Equal weights may not reflect the decision-makers’ priorities. Audit ratings and triangular spreads require consistency checks, and E1 may duplicate P1 if poorly defined. Rankings depend on candidate inclusion and normalization bounds. An agreement between methods would not establish ground truth. Once observations are independently checked, the score can support an initial order for technical and funding review, while treatment effectiveness and budget-optimal project selection remain separate questions.</w:t>
+        <w:t>Weight sensitivity uses 1,000 reproducible draws with seed 20261009. Each equal weight is multiplied by an independent uniform factor between 0.8 and 1.2, then the vector is renormalised. These bounds are an exploratory scenario, not an elicited distribution of stakeholder preferences. HYP-A leads 864 draws (86.4%) and HYP-B leads 136 (13.6%). Thus even the leading base candidate is conditional on the chosen weighting assumptions. The saved SVG visualises these frequencies.</w:t>
+      </w:r>
+    </w:p>
+    <w:p>
+      <w:r>
+        <w:t>Uncertainty sensitivity contracts each triangle around its central value using x̃(α) = c + α(x̃−c), for α = 0, 0.5 and 1, then recomputes the shared normalisation bounds. HYP-A remains first in these three scenarios. At α=0, B and C tie for second; at α=0.5, C is third and D fourth; at α=1, D is third. Rank correlations with the full-width model are approximately 0.632, 0.800 and 1.000. These are stress tests of the representation and its scaling, not improved measurements or calibrated uncertainty estimates.</w:t>
+      </w:r>
+    </w:p>
+    <w:p>
+      <w:r>
+        <w:br w:type="page"/>
+      </w:r>
+    </w:p>
+    <w:p>
+      <w:pPr>
+        <w:pStyle w:val="Heading1"/>
+      </w:pPr>
+      <w:r>
+        <w:t>9 Interpretation and independent validation plan</w:t>
+      </w:r>
+    </w:p>
+    <w:p>
+      <w:r>
+        <w:t>The calculation trace explains why a package receives its score: each criterion contributes a distance to the two ideals, and the summed distances determine closeness. A reviewer can inspect a high score alongside the original count intervals and audit photographs. The trace is more defensible than treating a final ranking as self-explanatory. In practice, close alternatives should be discussed together and checked for measurement differences that could reverse their order.</w:t>
+      </w:r>
+    </w:p>
+    <w:p>
+      <w:r>
+        <w:t>Independent validation remains pending data collection. A reviewer who did not provide the original ratings should examine a preregistered sample of crossing records or sites without seeing model ranks. The validation form records accessibility barriers, control and visibility concerns, proposed action suitability and a written assessment of urgency. Preserve disagreements rather than adjusting inputs to match the model. Report the sample selection rule, reviewer role, evidence dates, agreement and unresolved differences. Expert agreement would support practical relevance, but would still not prove a reduction in crashes.</w:t>
+      </w:r>
+    </w:p>
+    <w:p>
+      <w:r>
+        <w:t>The destination extension requires a verified destination inventory, walking routes and a defined catchment. Assess whether a crossing is a necessary link and whether a usable alternative route exists. An ordinary destination count can duplicate pedestrian demand and should not automatically become E1. The exported pairwise central-value correlations provide an initial overlap screen. A larger field sample and substantive route inspection are needed to decide whether the extension adds a distinct decision dimension.</w:t>
+      </w:r>
+    </w:p>
+    <w:p>
+      <w:pPr>
+        <w:pStyle w:val="Heading1"/>
+      </w:pPr>
+      <w:r>
+        <w:t>10 Limitations and remaining fieldwork</w:t>
+      </w:r>
+    </w:p>
+    <w:p>
+      <w:r>
+        <w:t>There is no empirical ranking in this submission. The four HYP alternatives are invented solely for reproducibility and demonstration. Site identity, feasibility, observations, photo evidence and destination access have not been verified. The 0–3 audit rubric is a proposed study scale, not an Indian compliance standard. The exact instructor handout and individual author details were not supplied, so institutional formatting and contribution declarations require student review before submission.</w:t>
+      </w:r>
+    </w:p>
+    <w:p>
+      <w:r>
+        <w:t>Min–max bounds depend on the candidate set; adding or removing a crossing can change scores and ordering. Triangular ranges combine observed variability with a shape assumption and do not encode a probability distribution. Equal weights and the perturbation interval express provisional choices. Uncertainty contraction also changes normalisation, so its effects should not be attributed solely to fuzziness. A small top-group overlap metric can conceal a major first-place reversal; multiple evaluation summaries are therefore reported.</w:t>
+      </w:r>
+    </w:p>
+    <w:p>
+      <w:r>
+        <w:t>A priority order is not a budget-optimal portfolio. Real decisions need cost estimates, implementation dependencies, jurisdiction, accessibility requirements and engineering feasibility. Intervention effects and crash reduction would need a different evaluation design. The method must not be used to claim that a low-ranked crossing is safe, or that a high-ranked package has a quantified benefit. It supports a review process within a verified candidate set.</w:t>
+      </w:r>
+    </w:p>
+    <w:p>
+      <w:pPr>
+        <w:pStyle w:val="Heading1"/>
+      </w:pPr>
+      <w:r>
+        <w:t>11 Conclusion</w:t>
+      </w:r>
+    </w:p>
+    <w:p>
+      <w:r>
+        <w:t>The project delivers a complete executable demonstration of a declared triangular fuzzy TOPSIS adaptation, a transparent crisp comparator and an essential-destination extension. The example demonstrates why assumption checks matter: weight variation changes the leading candidate in some draws, uncertainty contraction changes lower ranks, and the extension changes the winner. The implementation exposes intermediate calculations and rejects incomplete inputs. The remaining empirical contribution is to collect and verify the crossing evidence, run the same pipeline and obtain independent review. Until then, the defensible result is methodological reproducibility, not a recommendation for a real crossing.</w:t>
+      </w:r>
+    </w:p>
+    <w:p>
+      <w:r>
+        <w:br w:type="page"/>
       </w:r>
     </w:p>
     <w:p>
@@ -695,90 +1715,33 @@
       </w:r>
     </w:p>
     <w:p>
-      <w:pPr>
-        <w:spacing w:after="40"/>
-      </w:pPr>
       <w:r>
-        <w:rPr>
-          <w:sz w:val="16"/>
-        </w:rPr>
-        <w:t>Chen, C.-T. (2000). Extensions of the TOPSIS for group decision-making under fuzzy environment. Fuzzy Sets and Systems, 114(1), 1–9. https://doi.org/10.1016/S0165-0114(97)00377-1</w:t>
+        <w:t>[1] Battistini, R., Lantieri, C., Simone, A., Dondi, G., &amp; Vignali, V. (2023). A Decision Support System for the safety evaluation of urban pedestrian crossings. Transportation Research Procedia, 69, 655–662. doi:10.1016/j.trpro.2023.02.220 https://cris.unibo.it/handle/11585/918597</w:t>
       </w:r>
     </w:p>
     <w:p>
-      <w:pPr>
-        <w:spacing w:after="40"/>
-      </w:pPr>
       <w:r>
-        <w:rPr>
-          <w:sz w:val="16"/>
-        </w:rPr>
-        <w:t>Battistini, R., Lantieri, C., Simone, A., Dondi, G., &amp; Vignali, V. (2023). A Decision Support System for the safety evaluation of urban pedestrian crossings. Transportation Research Procedia, 69, 655–662. https://doi.org/10.1016/j.trpro.2023.02.220</w:t>
+        <w:t>[2] Majumdar, B. B., Sahu, P. K., Patil, M., &amp; Vendotti, N. (2021). Pedestrian Satisfaction-Based Methodology for Prioritization of Critical Sidewalk and Crosswalk Attributes Influencing Walkability. Journal of Urban Planning and Development, 147(3), 04021032. doi:10.1061/(ASCE)UP.1943-5444.0000718 https://doi.org/10.1061/(ASCE)UP.1943-5444.0000718</w:t>
       </w:r>
     </w:p>
     <w:p>
-      <w:pPr>
-        <w:spacing w:after="40"/>
-      </w:pPr>
       <w:r>
-        <w:rPr>
-          <w:sz w:val="16"/>
-        </w:rPr>
-        <w:t>Majumdar, B. B., Sahu, P. K., Patil, M., &amp; Vendotti, N. (2021). Pedestrian Satisfaction-Based Methodology for Prioritization of Critical Sidewalk and Crosswalk Attributes Influencing Walkability. Journal of Urban Planning and Development, 147(3), 04021032. https://doi.org/10.1061/(ASCE)UP.1943-5444.0000718</w:t>
+        <w:t>[3] Alver, Y., &amp; Katanalp, B. Y. (2022). Evaluating the Pedestrian Gap Acceptance in Semicontrolled Midblock Crosswalks with an Integrated AHP-FL Approach. Journal of Transportation Engineering, Part A: Systems, 148(9), 04022066. doi:10.1061/JTEPBS.0000720 https://doi.org/10.1061/JTEPBS.0000720</w:t>
       </w:r>
     </w:p>
     <w:p>
-      <w:pPr>
-        <w:spacing w:after="40"/>
-      </w:pPr>
       <w:r>
-        <w:rPr>
-          <w:sz w:val="16"/>
-        </w:rPr>
-        <w:t>Alver, Y., &amp; Katanalp, B. Y. (2022). Evaluating the Pedestrian Gap Acceptance in Semicontrolled Midblock Crosswalks with an Integrated AHP-FL Approach. Journal of Transportation Engineering, Part A: Systems, 148(9), 04022066. https://doi.org/10.1061/JTEPBS.0000720</w:t>
+        <w:t>[4] Chen, C.-T. (2000). Extensions of the TOPSIS for group decision-making under fuzzy environment. Fuzzy Sets and Systems, 114(1), 1–9. doi:10.1016/S0165-0114(97)00377-1 https://doi.org/10.1016/S0165-0114(97)00377-1</w:t>
       </w:r>
     </w:p>
     <w:p>
-      <w:pPr>
-        <w:spacing w:after="40"/>
-      </w:pPr>
       <w:r>
-        <w:rPr>
-          <w:sz w:val="16"/>
-        </w:rPr>
-        <w:t>Federal Highway Administration. (2016). Improving Pedestrian Treatments at Unsignalized Crossings. https://highways.dot.gov/safety/data-analysis-tools/rsdp/rsdp-tools/improving-pedestrian-treatments-unsignalized-crossings</w:t>
+        <w:t>[5] Jefmański, B., &amp; Sagan, A. (2021). Item Response Theory Models for the Fuzzy TOPSIS in the Analysis of Survey Data. Symmetry, 13(2), 223. doi:10.3390/sym13020223 https://doi.org/10.3390/sym13020223</w:t>
       </w:r>
     </w:p>
     <w:p>
-      <w:pPr>
-        <w:spacing w:after="40"/>
-      </w:pPr>
       <w:r>
-        <w:rPr>
-          <w:sz w:val="16"/>
-        </w:rPr>
-        <w:t>Federal Highway Administration. (2021). Crosswalk Visibility Enhancements (FHWA-SA-21-049). https://highways.dot.gov/safety/proven-safety-countermeasures/crosswalk-visibility-enhancements</w:t>
-      </w:r>
-    </w:p>
-    <w:p>
-      <w:pPr>
-        <w:spacing w:after="40"/>
-      </w:pPr>
-      <w:r>
-        <w:rPr>
-          <w:sz w:val="16"/>
-        </w:rPr>
-      </w:r>
-    </w:p>
-    <w:p>
-      <w:pPr>
-        <w:spacing w:after="40"/>
-      </w:pPr>
-      <w:r>
-        <w:rPr>
-          <w:sz w:val="16"/>
-        </w:rPr>
-        <w:t>Jefmański, B., &amp; Sagan, A. (2021). Item Response Theory Models for the Fuzzy TOPSIS in the Analysis of Survey Data. Symmetry, 13(2), 223. https://doi.org/10.3390/sym13020223</w:t>
+        <w:t>[6] OpenStreetMap contributors. OpenStreetMap. https://www.openstreetmap.org/copyright</w:t>
       </w:r>
     </w:p>
     <w:p>
@@ -786,17 +1749,231 @@
         <w:pStyle w:val="Heading1"/>
       </w:pPr>
       <w:r>
-        <w:t>Appendix A. Worked example (hypothetical only)</w:t>
+        <w:t>Appendix A Independent arithmetic example</w:t>
       </w:r>
     </w:p>
     <w:p>
       <w:r>
-        <w:t>For an independent two-criterion check, let hypothetical alternative A have normalized triangles (0.2,0.4,0.6) and (0.5,0.7,0.9), with weights 0.4 and 0.6. Its weighted triangles are (0.08,0.16,0.24) and (0.30,0.42,0.54); positive ideals are (0.4,0.4,0.4) and (0.6,0.6,0.6), while both negative ideals are (0,0,0). The positive vertex distances are sqrt[(0.32²+0.24²+0.16²)/3]=0.2487301081 and sqrt[(0.30²+0.18²+0.06²)/3]=0.2049390153. The negative distances are sqrt[(0.08²+0.16²+0.24²)/3]=0.1728197520 and sqrt[(0.30²+0.42²+0.54²)/3]=0.4312771731. Thus D+=0.4536691234, D−=0.6040969250 and C=0.5711063670. These values are asserted in the Python tests; they are hypothetical arithmetic, not field results.</w:t>
+        <w:t>Use two already normalised criteria with weights 0.4 and 0.6. Alternative A has triangles (0.2,0.4,0.6) and (0.5,0.7,0.9); alternative B has (0.7,0.8,0.9) and (0.1,0.2,0.3). For A, the weighted triangles are (0.08,0.16,0.24) and (0.30,0.42,0.54). The positive ideals are (0.4,0.4,0.4) and (0.6,0.6,0.6); both negative ideals are zero.</w:t>
       </w:r>
     </w:p>
+    <w:tbl>
+      <w:tblPr>
+        <w:tblStyle w:val="LightShading-Accent1"/>
+        <w:tblW w:type="auto" w:w="0"/>
+        <w:tblLook w:firstColumn="1" w:firstRow="1" w:lastColumn="0" w:lastRow="0" w:noHBand="0" w:noVBand="1" w:val="04A0"/>
+      </w:tblPr>
+      <w:tblGrid>
+        <w:gridCol w:w="2437"/>
+        <w:gridCol w:w="2437"/>
+        <w:gridCol w:w="2437"/>
+        <w:gridCol w:w="2437"/>
+      </w:tblGrid>
+      <w:tr>
+        <w:trPr>
+          <w:tblHeader/>
+        </w:trPr>
+        <w:tc>
+          <w:tcPr>
+            <w:tcW w:type="dxa" w:w="2437"/>
+          </w:tcPr>
+          <w:p>
+            <w:pPr>
+              <w:spacing w:after="80"/>
+            </w:pPr>
+            <w:r>
+              <w:rPr>
+                <w:sz w:val="20"/>
+              </w:rPr>
+              <w:t>Quantity for A</w:t>
+            </w:r>
+          </w:p>
+        </w:tc>
+        <w:tc>
+          <w:tcPr>
+            <w:tcW w:type="dxa" w:w="2437"/>
+          </w:tcPr>
+          <w:p>
+            <w:pPr>
+              <w:spacing w:after="80"/>
+            </w:pPr>
+            <w:r>
+              <w:rPr>
+                <w:sz w:val="20"/>
+              </w:rPr>
+              <w:t>Criterion 1</w:t>
+            </w:r>
+          </w:p>
+        </w:tc>
+        <w:tc>
+          <w:tcPr>
+            <w:tcW w:type="dxa" w:w="2437"/>
+          </w:tcPr>
+          <w:p>
+            <w:pPr>
+              <w:spacing w:after="80"/>
+            </w:pPr>
+            <w:r>
+              <w:rPr>
+                <w:sz w:val="20"/>
+              </w:rPr>
+              <w:t>Criterion 2</w:t>
+            </w:r>
+          </w:p>
+        </w:tc>
+        <w:tc>
+          <w:tcPr>
+            <w:tcW w:type="dxa" w:w="2437"/>
+          </w:tcPr>
+          <w:p>
+            <w:pPr>
+              <w:spacing w:after="80"/>
+            </w:pPr>
+            <w:r>
+              <w:rPr>
+                <w:sz w:val="20"/>
+              </w:rPr>
+              <w:t>Sum</w:t>
+            </w:r>
+          </w:p>
+        </w:tc>
+      </w:tr>
+      <w:tr>
+        <w:tc>
+          <w:tcPr>
+            <w:tcW w:type="dxa" w:w="2437"/>
+          </w:tcPr>
+          <w:p>
+            <w:pPr>
+              <w:spacing w:after="80"/>
+            </w:pPr>
+            <w:r>
+              <w:rPr>
+                <w:sz w:val="20"/>
+              </w:rPr>
+              <w:t>Distance to positive</w:t>
+            </w:r>
+          </w:p>
+        </w:tc>
+        <w:tc>
+          <w:tcPr>
+            <w:tcW w:type="dxa" w:w="2437"/>
+          </w:tcPr>
+          <w:p>
+            <w:pPr>
+              <w:spacing w:after="80"/>
+            </w:pPr>
+            <w:r>
+              <w:rPr>
+                <w:sz w:val="20"/>
+              </w:rPr>
+              <w:t>0.2487301081</w:t>
+            </w:r>
+          </w:p>
+        </w:tc>
+        <w:tc>
+          <w:tcPr>
+            <w:tcW w:type="dxa" w:w="2437"/>
+          </w:tcPr>
+          <w:p>
+            <w:pPr>
+              <w:spacing w:after="80"/>
+            </w:pPr>
+            <w:r>
+              <w:rPr>
+                <w:sz w:val="20"/>
+              </w:rPr>
+              <w:t>0.2049390153</w:t>
+            </w:r>
+          </w:p>
+        </w:tc>
+        <w:tc>
+          <w:tcPr>
+            <w:tcW w:type="dxa" w:w="2437"/>
+          </w:tcPr>
+          <w:p>
+            <w:pPr>
+              <w:spacing w:after="80"/>
+            </w:pPr>
+            <w:r>
+              <w:rPr>
+                <w:sz w:val="20"/>
+              </w:rPr>
+              <w:t>0.4536691234</w:t>
+            </w:r>
+          </w:p>
+        </w:tc>
+      </w:tr>
+      <w:tr>
+        <w:tc>
+          <w:tcPr>
+            <w:tcW w:type="dxa" w:w="2437"/>
+          </w:tcPr>
+          <w:p>
+            <w:pPr>
+              <w:spacing w:after="80"/>
+            </w:pPr>
+            <w:r>
+              <w:rPr>
+                <w:sz w:val="20"/>
+              </w:rPr>
+              <w:t>Distance to negative</w:t>
+            </w:r>
+          </w:p>
+        </w:tc>
+        <w:tc>
+          <w:tcPr>
+            <w:tcW w:type="dxa" w:w="2437"/>
+          </w:tcPr>
+          <w:p>
+            <w:pPr>
+              <w:spacing w:after="80"/>
+            </w:pPr>
+            <w:r>
+              <w:rPr>
+                <w:sz w:val="20"/>
+              </w:rPr>
+              <w:t>0.1728197520</w:t>
+            </w:r>
+          </w:p>
+        </w:tc>
+        <w:tc>
+          <w:tcPr>
+            <w:tcW w:type="dxa" w:w="2437"/>
+          </w:tcPr>
+          <w:p>
+            <w:pPr>
+              <w:spacing w:after="80"/>
+            </w:pPr>
+            <w:r>
+              <w:rPr>
+                <w:sz w:val="20"/>
+              </w:rPr>
+              <w:t>0.4312771731</w:t>
+            </w:r>
+          </w:p>
+        </w:tc>
+        <w:tc>
+          <w:tcPr>
+            <w:tcW w:type="dxa" w:w="2437"/>
+          </w:tcPr>
+          <w:p>
+            <w:pPr>
+              <w:spacing w:after="80"/>
+            </w:pPr>
+            <w:r>
+              <w:rPr>
+                <w:sz w:val="20"/>
+              </w:rPr>
+              <w:t>0.6040969250</w:t>
+            </w:r>
+          </w:p>
+        </w:tc>
+      </w:tr>
+    </w:tbl>
     <w:p>
       <w:r>
-        <w:t>For (0.2,0.4,0.6), membership at 0.3 is 0.5, at 0.4 is 1, and at 0.5 is 0.5. These values express compatibility with the assumed imprecise rating, not observed frequencies or probabilities.</w:t>
+        <w:t>For example, the first positive distance is √[(0.32²+0.24²+0.16²)/3] = 0.2487301081. Thus C_A = 0.6040969250 / (0.4536691234+0.6040969250) = 0.5711063670. The automated check compares these independently calculated constants to the implementation. The demonstration calculation trace extends this audit trail to every baseline alternative and criterion.</w:t>
       </w:r>
     </w:p>
     <w:p>
@@ -804,169 +1981,40 @@
         <w:pStyle w:val="Heading1"/>
       </w:pPr>
       <w:r>
-        <w:t>Appendix B. Workflow</w:t>
-      </w:r>
-    </w:p>
-    <w:p>
-      <w:pPr>
-        <w:jc w:val="center"/>
-      </w:pPr>
-      <w:r>
-        <w:t>Figure B1. Project workflow from site verification to independent review.</w:t>
+        <w:t>Appendix B Reproduction and field handoff</w:t>
       </w:r>
     </w:p>
     <w:p>
       <w:r>
-        <w:t>No empirical ranking table appears because the required field observations do not exist in the supplied materials. All demonstration rankings and figures are explicitly marked hypothetical. The complete independent worked calculation also appears in docs/worked_example.md.</w:t>
+        <w:t>Install requirements.txt in a Python 3.10+ environment. Run python src/run_project.py --demo and python -m unittest discover -s tests -v. For real data, complete a copy of data/raw_observation_template.csv and retain the count and audit forms. Run python src/run_project.py --input data/my_completed_observations.csv --output-dir results/field_run. Keep hypothetical and field outputs separate. The field prefix identifies the input mode, not independently certified data.</w:t>
       </w:r>
     </w:p>
-    <w:tbl>
-      <w:tblPr>
-        <w:tblW w:type="auto" w:w="0"/>
-        <w:jc w:val="center"/>
-        <w:tblLayout w:type="fixed"/>
-        <w:tblLook w:firstColumn="1" w:firstRow="1" w:lastColumn="0" w:lastRow="0" w:noHBand="0" w:noVBand="1" w:val="04A0"/>
-      </w:tblPr>
-      <w:tblGrid>
-        <w:gridCol w:w="8208"/>
-      </w:tblGrid>
-      <w:tr>
-        <w:tc>
-          <w:tcPr>
-            <w:tcW w:type="dxa" w:w="8208"/>
-            <w:vAlign w:val="center"/>
-          </w:tcPr>
-          <w:p>
-            <w:pPr>
-              <w:jc w:val="center"/>
-            </w:pPr>
-            <w:r>
-              <w:rPr>
-                <w:b/>
-                <w:sz w:val="18"/>
-              </w:rPr>
-              <w:t>1. Verify crossing inventory and boundary</w:t>
-            </w:r>
-          </w:p>
-        </w:tc>
-      </w:tr>
-      <w:tr>
-        <w:tc>
-          <w:tcPr>
-            <w:tcW w:type="dxa" w:w="8208"/>
-            <w:vAlign w:val="center"/>
-          </w:tcPr>
-          <w:p>
-            <w:pPr>
-              <w:jc w:val="center"/>
-            </w:pPr>
-            <w:r>
-              <w:t>↓</w:t>
-            </w:r>
-          </w:p>
-        </w:tc>
-      </w:tr>
-      <w:tr>
-        <w:tc>
-          <w:tcPr>
-            <w:tcW w:type="dxa" w:w="8208"/>
-            <w:vAlign w:val="center"/>
-          </w:tcPr>
-          <w:p>
-            <w:pPr>
-              <w:jc w:val="center"/>
-            </w:pPr>
-            <w:r>
-              <w:rPr>
-                <w:b/>
-                <w:sz w:val="18"/>
-              </w:rPr>
-              <w:t>2. Define feasible intervention alternatives</w:t>
-            </w:r>
-          </w:p>
-        </w:tc>
-      </w:tr>
-      <w:tr>
-        <w:tc>
-          <w:tcPr>
-            <w:tcW w:type="dxa" w:w="8208"/>
-            <w:vAlign w:val="center"/>
-          </w:tcPr>
-          <w:p>
-            <w:pPr>
-              <w:jc w:val="center"/>
-            </w:pPr>
-            <w:r>
-              <w:t>↓</w:t>
-            </w:r>
-          </w:p>
-        </w:tc>
-      </w:tr>
-      <w:tr>
-        <w:tc>
-          <w:tcPr>
-            <w:tcW w:type="dxa" w:w="8208"/>
-            <w:vAlign w:val="center"/>
-          </w:tcPr>
-          <w:p>
-            <w:pPr>
-              <w:jc w:val="center"/>
-            </w:pPr>
-            <w:r>
-              <w:rPr>
-                <w:b/>
-                <w:sz w:val="18"/>
-              </w:rPr>
-              <w:t>3. Collect repeated counts and paired audits</w:t>
-            </w:r>
-          </w:p>
-        </w:tc>
-      </w:tr>
-      <w:tr>
-        <w:tc>
-          <w:tcPr>
-            <w:tcW w:type="dxa" w:w="8208"/>
-            <w:vAlign w:val="center"/>
-          </w:tcPr>
-          <w:p>
-            <w:pPr>
-              <w:jc w:val="center"/>
-            </w:pPr>
-            <w:r>
-              <w:t>↓</w:t>
-            </w:r>
-          </w:p>
-        </w:tc>
-      </w:tr>
-      <w:tr>
-        <w:tc>
-          <w:tcPr>
-            <w:tcW w:type="dxa" w:w="8208"/>
-            <w:vAlign w:val="center"/>
-          </w:tcPr>
-          <w:p>
-            <w:pPr>
-              <w:jc w:val="center"/>
-            </w:pPr>
-            <w:r>
-              <w:rPr>
-                <w:b/>
-                <w:sz w:val="18"/>
-              </w:rPr>
-              <w:t>4. Clean and orient data → Fuzzy TOPSIS → baseline and extension comparison → sensitivity → independent review</w:t>
-            </w:r>
-          </w:p>
-        </w:tc>
-      </w:tr>
-    </w:tbl>
+    <w:p>
+      <w:r>
+        <w:t>README.md documents all exports. docs/field_readiness.md lists evidence needed before field interpretation; docs/viva_guide.md explains the main modelling choices. The author should complete docs/contribution_log.csv with actual work history. Report regeneration additionally requires python-docx and uses scripts/build_report.py after regenerating the demo.</w:t>
+      </w:r>
+    </w:p>
     <w:sectPr>
-      <w:pgSz w:w="12240" w:h="15840"/>
-      <w:pgMar w:top="936" w:right="1008" w:bottom="936" w:left="1008" w:header="720" w:footer="720" w:gutter="0"/>
+      <w:footerReference w:type="default" r:id="rId9"/>
+      <w:pgSz w:w="11909" w:h="16834"/>
+      <w:pgMar w:top="1008" w:right="1080" w:bottom="1008" w:left="1080" w:header="720" w:footer="720" w:gutter="0"/>
       <w:cols w:space="720"/>
       <w:docGrid w:linePitch="360"/>
     </w:sectPr>
   </w:body>
 </w:document>
+</file>
+
+<file path=word/footer1.xml><?xml version="1.0" encoding="utf-8"?>
+<w:ftr xmlns:m="http://schemas.openxmlformats.org/officeDocument/2006/math" xmlns:mc="http://schemas.openxmlformats.org/markup-compatibility/2006" xmlns:mo="http://schemas.microsoft.com/office/mac/office/2008/main" xmlns:mv="urn:schemas-microsoft-com:mac:vml" xmlns:o="urn:schemas-microsoft-com:office:office" xmlns:r="http://schemas.openxmlformats.org/officeDocument/2006/relationships" xmlns:v="urn:schemas-microsoft-com:vml" xmlns:w10="urn:schemas-microsoft-com:office:word" xmlns:w14="http://schemas.microsoft.com/office/word/2010/wordml" xmlns:w="http://schemas.openxmlformats.org/wordprocessingml/2006/main" xmlns:wne="http://schemas.microsoft.com/office/word/2006/wordml" xmlns:wp14="http://schemas.microsoft.com/office/word/2010/wordprocessingDrawing" xmlns:wp="http://schemas.openxmlformats.org/drawingml/2006/wordprocessingDrawing" xmlns:wpc="http://schemas.microsoft.com/office/word/2010/wordprocessingCanvas" xmlns:wpg="http://schemas.microsoft.com/office/word/2010/wordprocessingGroup" xmlns:wpi="http://schemas.microsoft.com/office/word/2010/wordprocessingInk" xmlns:wps="http://schemas.microsoft.com/office/word/2010/wordprocessingShape" mc:Ignorable="w14 wp14">
+  <w:p>
+    <w:pPr>
+      <w:pStyle w:val="Footer"/>
+      <w:jc w:val="right"/>
+    </w:pPr>
+    <w:fldSimple w:instr="PAGE"/>
+  </w:p>
+</w:ftr>
 </file>
 
 <file path=word/numbering.xml><?xml version="1.0" encoding="utf-8"?>
@@ -1332,9 +2380,12 @@
     <w:name w:val="Normal"/>
     <w:qFormat/>
     <w:rsid w:val="00FC693F"/>
+    <w:pPr>
+      <w:spacing w:after="140" w:line="259" w:lineRule="auto"/>
+    </w:pPr>
     <w:rPr>
       <w:rFonts w:ascii="Times New Roman" w:hAnsi="Times New Roman"/>
-      <w:sz w:val="18"/>
+      <w:sz w:val="22"/>
     </w:rPr>
   </w:style>
   <w:style w:type="paragraph" w:styleId="Header">
@@ -1396,10 +2447,11 @@
       <w:outlineLvl w:val="0"/>
     </w:pPr>
     <w:rPr>
-      <w:rFonts w:asciiTheme="majorHAnsi" w:eastAsiaTheme="majorEastAsia" w:hAnsiTheme="majorHAnsi" w:cstheme="majorBidi" w:ascii="Times New Roman" w:hAnsi="Times New Roman"/>
+      <w:rFonts w:cstheme="majorBidi" w:ascii="Times New Roman" w:hAnsi="Times New Roman"/>
       <w:b/>
       <w:bCs/>
-      <w:sz w:val="24"/>
+      <w:color w:val="000000"/>
+      <w:sz w:val="28"/>
       <w:szCs w:val="28"/>
     </w:rPr>
   </w:style>
@@ -1419,10 +2471,11 @@
       <w:outlineLvl w:val="1"/>
     </w:pPr>
     <w:rPr>
-      <w:rFonts w:asciiTheme="majorHAnsi" w:eastAsiaTheme="majorEastAsia" w:hAnsiTheme="majorHAnsi" w:cstheme="majorBidi" w:ascii="Times New Roman" w:hAnsi="Times New Roman"/>
+      <w:rFonts w:cstheme="majorBidi" w:ascii="Times New Roman" w:hAnsi="Times New Roman"/>
       <w:b/>
       <w:bCs/>
-      <w:sz w:val="20"/>
+      <w:color w:val="000000"/>
+      <w:sz w:val="24"/>
       <w:szCs w:val="26"/>
     </w:rPr>
   </w:style>
@@ -1442,7 +2495,7 @@
       <w:outlineLvl w:val="2"/>
     </w:pPr>
     <w:rPr>
-      <w:rFonts w:asciiTheme="majorHAnsi" w:eastAsiaTheme="majorEastAsia" w:hAnsiTheme="majorHAnsi" w:cstheme="majorBidi"/>
+      <w:rFonts w:cstheme="majorBidi"/>
       <w:b/>
       <w:bCs/>
       <w:color w:val="4F81BD" w:themeColor="accent1"/>
@@ -1465,7 +2518,7 @@
       <w:outlineLvl w:val="3"/>
     </w:pPr>
     <w:rPr>
-      <w:rFonts w:asciiTheme="majorHAnsi" w:eastAsiaTheme="majorEastAsia" w:hAnsiTheme="majorHAnsi" w:cstheme="majorBidi"/>
+      <w:rFonts w:cstheme="majorBidi"/>
       <w:b/>
       <w:bCs/>
       <w:i/>
@@ -1490,7 +2543,7 @@
       <w:outlineLvl w:val="4"/>
     </w:pPr>
     <w:rPr>
-      <w:rFonts w:asciiTheme="majorHAnsi" w:eastAsiaTheme="majorEastAsia" w:hAnsiTheme="majorHAnsi" w:cstheme="majorBidi"/>
+      <w:rFonts w:cstheme="majorBidi"/>
       <w:color w:val="243F60" w:themeColor="accent1" w:themeShade="7F"/>
     </w:rPr>
   </w:style>
@@ -1511,7 +2564,7 @@
       <w:outlineLvl w:val="5"/>
     </w:pPr>
     <w:rPr>
-      <w:rFonts w:asciiTheme="majorHAnsi" w:eastAsiaTheme="majorEastAsia" w:hAnsiTheme="majorHAnsi" w:cstheme="majorBidi"/>
+      <w:rFonts w:cstheme="majorBidi"/>
       <w:i/>
       <w:iCs/>
       <w:color w:val="243F60" w:themeColor="accent1" w:themeShade="7F"/>
@@ -1534,7 +2587,7 @@
       <w:outlineLvl w:val="6"/>
     </w:pPr>
     <w:rPr>
-      <w:rFonts w:asciiTheme="majorHAnsi" w:eastAsiaTheme="majorEastAsia" w:hAnsiTheme="majorHAnsi" w:cstheme="majorBidi"/>
+      <w:rFonts w:cstheme="majorBidi"/>
       <w:i/>
       <w:iCs/>
       <w:color w:val="404040" w:themeColor="text1" w:themeTint="BF"/>
@@ -1557,7 +2610,7 @@
       <w:outlineLvl w:val="7"/>
     </w:pPr>
     <w:rPr>
-      <w:rFonts w:asciiTheme="majorHAnsi" w:eastAsiaTheme="majorEastAsia" w:hAnsiTheme="majorHAnsi" w:cstheme="majorBidi"/>
+      <w:rFonts w:cstheme="majorBidi"/>
       <w:color w:val="4F81BD" w:themeColor="accent1"/>
       <w:sz w:val="20"/>
       <w:szCs w:val="20"/>
@@ -1580,7 +2633,7 @@
       <w:outlineLvl w:val="8"/>
     </w:pPr>
     <w:rPr>
-      <w:rFonts w:asciiTheme="majorHAnsi" w:eastAsiaTheme="majorEastAsia" w:hAnsiTheme="majorHAnsi" w:cstheme="majorBidi"/>
+      <w:rFonts w:cstheme="majorBidi"/>
       <w:i/>
       <w:iCs/>
       <w:color w:val="404040" w:themeColor="text1" w:themeTint="BF"/>
@@ -1631,7 +2684,7 @@
     <w:uiPriority w:val="9"/>
     <w:rsid w:val="00FC693F"/>
     <w:rPr>
-      <w:rFonts w:asciiTheme="majorHAnsi" w:eastAsiaTheme="majorEastAsia" w:hAnsiTheme="majorHAnsi" w:cstheme="majorBidi"/>
+      <w:rFonts w:cstheme="majorBidi"/>
       <w:b/>
       <w:bCs/>
       <w:color w:val="365F91" w:themeColor="accent1" w:themeShade="BF"/>
@@ -1646,7 +2699,7 @@
     <w:uiPriority w:val="9"/>
     <w:rsid w:val="00FC693F"/>
     <w:rPr>
-      <w:rFonts w:asciiTheme="majorHAnsi" w:eastAsiaTheme="majorEastAsia" w:hAnsiTheme="majorHAnsi" w:cstheme="majorBidi"/>
+      <w:rFonts w:cstheme="majorBidi"/>
       <w:b/>
       <w:bCs/>
       <w:color w:val="4F81BD" w:themeColor="accent1"/>
@@ -1661,7 +2714,7 @@
     <w:uiPriority w:val="9"/>
     <w:rsid w:val="00FC693F"/>
     <w:rPr>
-      <w:rFonts w:asciiTheme="majorHAnsi" w:eastAsiaTheme="majorEastAsia" w:hAnsiTheme="majorHAnsi" w:cstheme="majorBidi"/>
+      <w:rFonts w:cstheme="majorBidi"/>
       <w:b/>
       <w:bCs/>
       <w:color w:val="4F81BD" w:themeColor="accent1"/>
@@ -1676,18 +2729,15 @@
     <w:qFormat/>
     <w:rsid w:val="00FC693F"/>
     <w:pPr>
-      <w:pBdr>
-        <w:bottom w:val="single" w:sz="8" w:space="4" w:color="4F81BD" w:themeColor="accent1"/>
-      </w:pBdr>
       <w:spacing w:after="300" w:line="240" w:lineRule="auto"/>
       <w:contextualSpacing/>
     </w:pPr>
     <w:rPr>
-      <w:rFonts w:asciiTheme="majorHAnsi" w:eastAsiaTheme="majorEastAsia" w:hAnsiTheme="majorHAnsi" w:cstheme="majorBidi"/>
-      <w:color w:val="17365D" w:themeColor="text2" w:themeShade="BF"/>
+      <w:rFonts w:cstheme="majorBidi" w:ascii="Times New Roman" w:hAnsi="Times New Roman"/>
+      <w:color w:val="000000"/>
       <w:spacing w:val="5"/>
       <w:kern w:val="28"/>
-      <w:sz w:val="52"/>
+      <w:sz w:val="38"/>
       <w:szCs w:val="52"/>
     </w:rPr>
   </w:style>
@@ -1698,7 +2748,7 @@
     <w:uiPriority w:val="10"/>
     <w:rsid w:val="00FC693F"/>
     <w:rPr>
-      <w:rFonts w:asciiTheme="majorHAnsi" w:eastAsiaTheme="majorEastAsia" w:hAnsiTheme="majorHAnsi" w:cstheme="majorBidi"/>
+      <w:rFonts w:cstheme="majorBidi"/>
       <w:color w:val="17365D" w:themeColor="text2" w:themeShade="BF"/>
       <w:spacing w:val="5"/>
       <w:kern w:val="28"/>
@@ -1720,7 +2770,7 @@
       </w:numPr>
     </w:pPr>
     <w:rPr>
-      <w:rFonts w:asciiTheme="majorHAnsi" w:eastAsiaTheme="majorEastAsia" w:hAnsiTheme="majorHAnsi" w:cstheme="majorBidi"/>
+      <w:rFonts w:cstheme="majorBidi"/>
       <w:i/>
       <w:iCs/>
       <w:color w:val="4F81BD" w:themeColor="accent1"/>
@@ -1736,7 +2786,7 @@
     <w:uiPriority w:val="11"/>
     <w:rsid w:val="00FC693F"/>
     <w:rPr>
-      <w:rFonts w:asciiTheme="majorHAnsi" w:eastAsiaTheme="majorEastAsia" w:hAnsiTheme="majorHAnsi" w:cstheme="majorBidi"/>
+      <w:rFonts w:cstheme="majorBidi"/>
       <w:i/>
       <w:iCs/>
       <w:color w:val="4F81BD" w:themeColor="accent1"/>
@@ -2034,7 +3084,7 @@
     <w:semiHidden/>
     <w:rsid w:val="00FC693F"/>
     <w:rPr>
-      <w:rFonts w:asciiTheme="majorHAnsi" w:eastAsiaTheme="majorEastAsia" w:hAnsiTheme="majorHAnsi" w:cstheme="majorBidi"/>
+      <w:rFonts w:cstheme="majorBidi"/>
       <w:b/>
       <w:bCs/>
       <w:i/>
@@ -2050,7 +3100,7 @@
     <w:semiHidden/>
     <w:rsid w:val="00FC693F"/>
     <w:rPr>
-      <w:rFonts w:asciiTheme="majorHAnsi" w:eastAsiaTheme="majorEastAsia" w:hAnsiTheme="majorHAnsi" w:cstheme="majorBidi"/>
+      <w:rFonts w:cstheme="majorBidi"/>
       <w:color w:val="243F60" w:themeColor="accent1" w:themeShade="7F"/>
     </w:rPr>
   </w:style>
@@ -2062,7 +3112,7 @@
     <w:semiHidden/>
     <w:rsid w:val="00FC693F"/>
     <w:rPr>
-      <w:rFonts w:asciiTheme="majorHAnsi" w:eastAsiaTheme="majorEastAsia" w:hAnsiTheme="majorHAnsi" w:cstheme="majorBidi"/>
+      <w:rFonts w:cstheme="majorBidi"/>
       <w:i/>
       <w:iCs/>
       <w:color w:val="243F60" w:themeColor="accent1" w:themeShade="7F"/>
@@ -2076,7 +3126,7 @@
     <w:semiHidden/>
     <w:rsid w:val="00FC693F"/>
     <w:rPr>
-      <w:rFonts w:asciiTheme="majorHAnsi" w:eastAsiaTheme="majorEastAsia" w:hAnsiTheme="majorHAnsi" w:cstheme="majorBidi"/>
+      <w:rFonts w:cstheme="majorBidi"/>
       <w:i/>
       <w:iCs/>
       <w:color w:val="404040" w:themeColor="text1" w:themeTint="BF"/>
@@ -2090,7 +3140,7 @@
     <w:semiHidden/>
     <w:rsid w:val="00FC693F"/>
     <w:rPr>
-      <w:rFonts w:asciiTheme="majorHAnsi" w:eastAsiaTheme="majorEastAsia" w:hAnsiTheme="majorHAnsi" w:cstheme="majorBidi"/>
+      <w:rFonts w:cstheme="majorBidi"/>
       <w:color w:val="4F81BD" w:themeColor="accent1"/>
       <w:sz w:val="20"/>
       <w:szCs w:val="20"/>
@@ -2104,7 +3154,7 @@
     <w:semiHidden/>
     <w:rsid w:val="00FC693F"/>
     <w:rPr>
-      <w:rFonts w:asciiTheme="majorHAnsi" w:eastAsiaTheme="majorEastAsia" w:hAnsiTheme="majorHAnsi" w:cstheme="majorBidi"/>
+      <w:rFonts w:cstheme="majorBidi"/>
       <w:i/>
       <w:iCs/>
       <w:color w:val="404040" w:themeColor="text1" w:themeTint="BF"/>
@@ -2163,9 +3213,6 @@
     <w:qFormat/>
     <w:rsid w:val="00FC693F"/>
     <w:pPr>
-      <w:pBdr>
-        <w:bottom w:val="single" w:sz="4" w:space="4" w:color="4F81BD" w:themeColor="accent1"/>
-      </w:pBdr>
       <w:spacing w:before="200" w:after="280"/>
       <w:ind w:left="936" w:right="936"/>
     </w:pPr>
@@ -3693,7 +4740,7 @@
         <w:spacing w:before="0" w:after="0" w:line="240" w:lineRule="auto"/>
       </w:pPr>
       <w:rPr>
-        <w:rFonts w:asciiTheme="majorHAnsi" w:eastAsiaTheme="majorEastAsia" w:hAnsiTheme="majorHAnsi" w:cstheme="majorBidi"/>
+        <w:rFonts w:cstheme="majorBidi"/>
         <w:b/>
         <w:bCs/>
       </w:rPr>
@@ -3714,7 +4761,7 @@
         <w:spacing w:before="0" w:after="0" w:line="240" w:lineRule="auto"/>
       </w:pPr>
       <w:rPr>
-        <w:rFonts w:asciiTheme="majorHAnsi" w:eastAsiaTheme="majorEastAsia" w:hAnsiTheme="majorHAnsi" w:cstheme="majorBidi"/>
+        <w:rFonts w:cstheme="majorBidi"/>
         <w:b/>
         <w:bCs/>
       </w:rPr>
@@ -3732,14 +4779,14 @@
     </w:tblStylePr>
     <w:tblStylePr w:type="firstCol">
       <w:rPr>
-        <w:rFonts w:asciiTheme="majorHAnsi" w:eastAsiaTheme="majorEastAsia" w:hAnsiTheme="majorHAnsi" w:cstheme="majorBidi"/>
+        <w:rFonts w:cstheme="majorBidi"/>
         <w:b/>
         <w:bCs/>
       </w:rPr>
     </w:tblStylePr>
     <w:tblStylePr w:type="lastCol">
       <w:rPr>
-        <w:rFonts w:asciiTheme="majorHAnsi" w:eastAsiaTheme="majorEastAsia" w:hAnsiTheme="majorHAnsi" w:cstheme="majorBidi"/>
+        <w:rFonts w:cstheme="majorBidi"/>
         <w:b/>
         <w:bCs/>
       </w:rPr>
@@ -3823,7 +4870,7 @@
         <w:spacing w:before="0" w:after="0" w:line="240" w:lineRule="auto"/>
       </w:pPr>
       <w:rPr>
-        <w:rFonts w:asciiTheme="majorHAnsi" w:eastAsiaTheme="majorEastAsia" w:hAnsiTheme="majorHAnsi" w:cstheme="majorBidi"/>
+        <w:rFonts w:cstheme="majorBidi"/>
         <w:b/>
         <w:bCs/>
       </w:rPr>
@@ -3844,7 +4891,7 @@
         <w:spacing w:before="0" w:after="0" w:line="240" w:lineRule="auto"/>
       </w:pPr>
       <w:rPr>
-        <w:rFonts w:asciiTheme="majorHAnsi" w:eastAsiaTheme="majorEastAsia" w:hAnsiTheme="majorHAnsi" w:cstheme="majorBidi"/>
+        <w:rFonts w:cstheme="majorBidi"/>
         <w:b/>
         <w:bCs/>
       </w:rPr>
@@ -3862,14 +4909,14 @@
     </w:tblStylePr>
     <w:tblStylePr w:type="firstCol">
       <w:rPr>
-        <w:rFonts w:asciiTheme="majorHAnsi" w:eastAsiaTheme="majorEastAsia" w:hAnsiTheme="majorHAnsi" w:cstheme="majorBidi"/>
+        <w:rFonts w:cstheme="majorBidi"/>
         <w:b/>
         <w:bCs/>
       </w:rPr>
     </w:tblStylePr>
     <w:tblStylePr w:type="lastCol">
       <w:rPr>
-        <w:rFonts w:asciiTheme="majorHAnsi" w:eastAsiaTheme="majorEastAsia" w:hAnsiTheme="majorHAnsi" w:cstheme="majorBidi"/>
+        <w:rFonts w:cstheme="majorBidi"/>
         <w:b/>
         <w:bCs/>
       </w:rPr>
@@ -3953,7 +5000,7 @@
         <w:spacing w:before="0" w:after="0" w:line="240" w:lineRule="auto"/>
       </w:pPr>
       <w:rPr>
-        <w:rFonts w:asciiTheme="majorHAnsi" w:eastAsiaTheme="majorEastAsia" w:hAnsiTheme="majorHAnsi" w:cstheme="majorBidi"/>
+        <w:rFonts w:cstheme="majorBidi"/>
         <w:b/>
         <w:bCs/>
       </w:rPr>
@@ -3974,7 +5021,7 @@
         <w:spacing w:before="0" w:after="0" w:line="240" w:lineRule="auto"/>
       </w:pPr>
       <w:rPr>
-        <w:rFonts w:asciiTheme="majorHAnsi" w:eastAsiaTheme="majorEastAsia" w:hAnsiTheme="majorHAnsi" w:cstheme="majorBidi"/>
+        <w:rFonts w:cstheme="majorBidi"/>
         <w:b/>
         <w:bCs/>
       </w:rPr>
@@ -3992,14 +5039,14 @@
     </w:tblStylePr>
     <w:tblStylePr w:type="firstCol">
       <w:rPr>
-        <w:rFonts w:asciiTheme="majorHAnsi" w:eastAsiaTheme="majorEastAsia" w:hAnsiTheme="majorHAnsi" w:cstheme="majorBidi"/>
+        <w:rFonts w:cstheme="majorBidi"/>
         <w:b/>
         <w:bCs/>
       </w:rPr>
     </w:tblStylePr>
     <w:tblStylePr w:type="lastCol">
       <w:rPr>
-        <w:rFonts w:asciiTheme="majorHAnsi" w:eastAsiaTheme="majorEastAsia" w:hAnsiTheme="majorHAnsi" w:cstheme="majorBidi"/>
+        <w:rFonts w:cstheme="majorBidi"/>
         <w:b/>
         <w:bCs/>
       </w:rPr>
@@ -4083,7 +5130,7 @@
         <w:spacing w:before="0" w:after="0" w:line="240" w:lineRule="auto"/>
       </w:pPr>
       <w:rPr>
-        <w:rFonts w:asciiTheme="majorHAnsi" w:eastAsiaTheme="majorEastAsia" w:hAnsiTheme="majorHAnsi" w:cstheme="majorBidi"/>
+        <w:rFonts w:cstheme="majorBidi"/>
         <w:b/>
         <w:bCs/>
       </w:rPr>
@@ -4104,7 +5151,7 @@
         <w:spacing w:before="0" w:after="0" w:line="240" w:lineRule="auto"/>
       </w:pPr>
       <w:rPr>
-        <w:rFonts w:asciiTheme="majorHAnsi" w:eastAsiaTheme="majorEastAsia" w:hAnsiTheme="majorHAnsi" w:cstheme="majorBidi"/>
+        <w:rFonts w:cstheme="majorBidi"/>
         <w:b/>
         <w:bCs/>
       </w:rPr>
@@ -4122,14 +5169,14 @@
     </w:tblStylePr>
     <w:tblStylePr w:type="firstCol">
       <w:rPr>
-        <w:rFonts w:asciiTheme="majorHAnsi" w:eastAsiaTheme="majorEastAsia" w:hAnsiTheme="majorHAnsi" w:cstheme="majorBidi"/>
+        <w:rFonts w:cstheme="majorBidi"/>
         <w:b/>
         <w:bCs/>
       </w:rPr>
     </w:tblStylePr>
     <w:tblStylePr w:type="lastCol">
       <w:rPr>
-        <w:rFonts w:asciiTheme="majorHAnsi" w:eastAsiaTheme="majorEastAsia" w:hAnsiTheme="majorHAnsi" w:cstheme="majorBidi"/>
+        <w:rFonts w:cstheme="majorBidi"/>
         <w:b/>
         <w:bCs/>
       </w:rPr>
@@ -4213,7 +5260,7 @@
         <w:spacing w:before="0" w:after="0" w:line="240" w:lineRule="auto"/>
       </w:pPr>
       <w:rPr>
-        <w:rFonts w:asciiTheme="majorHAnsi" w:eastAsiaTheme="majorEastAsia" w:hAnsiTheme="majorHAnsi" w:cstheme="majorBidi"/>
+        <w:rFonts w:cstheme="majorBidi"/>
         <w:b/>
         <w:bCs/>
       </w:rPr>
@@ -4234,7 +5281,7 @@
         <w:spacing w:before="0" w:after="0" w:line="240" w:lineRule="auto"/>
       </w:pPr>
       <w:rPr>
-        <w:rFonts w:asciiTheme="majorHAnsi" w:eastAsiaTheme="majorEastAsia" w:hAnsiTheme="majorHAnsi" w:cstheme="majorBidi"/>
+        <w:rFonts w:cstheme="majorBidi"/>
         <w:b/>
         <w:bCs/>
       </w:rPr>
@@ -4252,14 +5299,14 @@
     </w:tblStylePr>
     <w:tblStylePr w:type="firstCol">
       <w:rPr>
-        <w:rFonts w:asciiTheme="majorHAnsi" w:eastAsiaTheme="majorEastAsia" w:hAnsiTheme="majorHAnsi" w:cstheme="majorBidi"/>
+        <w:rFonts w:cstheme="majorBidi"/>
         <w:b/>
         <w:bCs/>
       </w:rPr>
     </w:tblStylePr>
     <w:tblStylePr w:type="lastCol">
       <w:rPr>
-        <w:rFonts w:asciiTheme="majorHAnsi" w:eastAsiaTheme="majorEastAsia" w:hAnsiTheme="majorHAnsi" w:cstheme="majorBidi"/>
+        <w:rFonts w:cstheme="majorBidi"/>
         <w:b/>
         <w:bCs/>
       </w:rPr>
@@ -4343,7 +5390,7 @@
         <w:spacing w:before="0" w:after="0" w:line="240" w:lineRule="auto"/>
       </w:pPr>
       <w:rPr>
-        <w:rFonts w:asciiTheme="majorHAnsi" w:eastAsiaTheme="majorEastAsia" w:hAnsiTheme="majorHAnsi" w:cstheme="majorBidi"/>
+        <w:rFonts w:cstheme="majorBidi"/>
         <w:b/>
         <w:bCs/>
       </w:rPr>
@@ -4364,7 +5411,7 @@
         <w:spacing w:before="0" w:after="0" w:line="240" w:lineRule="auto"/>
       </w:pPr>
       <w:rPr>
-        <w:rFonts w:asciiTheme="majorHAnsi" w:eastAsiaTheme="majorEastAsia" w:hAnsiTheme="majorHAnsi" w:cstheme="majorBidi"/>
+        <w:rFonts w:cstheme="majorBidi"/>
         <w:b/>
         <w:bCs/>
       </w:rPr>
@@ -4382,14 +5429,14 @@
     </w:tblStylePr>
     <w:tblStylePr w:type="firstCol">
       <w:rPr>
-        <w:rFonts w:asciiTheme="majorHAnsi" w:eastAsiaTheme="majorEastAsia" w:hAnsiTheme="majorHAnsi" w:cstheme="majorBidi"/>
+        <w:rFonts w:cstheme="majorBidi"/>
         <w:b/>
         <w:bCs/>
       </w:rPr>
     </w:tblStylePr>
     <w:tblStylePr w:type="lastCol">
       <w:rPr>
-        <w:rFonts w:asciiTheme="majorHAnsi" w:eastAsiaTheme="majorEastAsia" w:hAnsiTheme="majorHAnsi" w:cstheme="majorBidi"/>
+        <w:rFonts w:cstheme="majorBidi"/>
         <w:b/>
         <w:bCs/>
       </w:rPr>
@@ -4473,7 +5520,7 @@
         <w:spacing w:before="0" w:after="0" w:line="240" w:lineRule="auto"/>
       </w:pPr>
       <w:rPr>
-        <w:rFonts w:asciiTheme="majorHAnsi" w:eastAsiaTheme="majorEastAsia" w:hAnsiTheme="majorHAnsi" w:cstheme="majorBidi"/>
+        <w:rFonts w:cstheme="majorBidi"/>
         <w:b/>
         <w:bCs/>
       </w:rPr>
@@ -4494,7 +5541,7 @@
         <w:spacing w:before="0" w:after="0" w:line="240" w:lineRule="auto"/>
       </w:pPr>
       <w:rPr>
-        <w:rFonts w:asciiTheme="majorHAnsi" w:eastAsiaTheme="majorEastAsia" w:hAnsiTheme="majorHAnsi" w:cstheme="majorBidi"/>
+        <w:rFonts w:cstheme="majorBidi"/>
         <w:b/>
         <w:bCs/>
       </w:rPr>
@@ -4512,14 +5559,14 @@
     </w:tblStylePr>
     <w:tblStylePr w:type="firstCol">
       <w:rPr>
-        <w:rFonts w:asciiTheme="majorHAnsi" w:eastAsiaTheme="majorEastAsia" w:hAnsiTheme="majorHAnsi" w:cstheme="majorBidi"/>
+        <w:rFonts w:cstheme="majorBidi"/>
         <w:b/>
         <w:bCs/>
       </w:rPr>
     </w:tblStylePr>
     <w:tblStylePr w:type="lastCol">
       <w:rPr>
-        <w:rFonts w:asciiTheme="majorHAnsi" w:eastAsiaTheme="majorEastAsia" w:hAnsiTheme="majorHAnsi" w:cstheme="majorBidi"/>
+        <w:rFonts w:cstheme="majorBidi"/>
         <w:b/>
         <w:bCs/>
       </w:rPr>
@@ -6384,7 +7431,7 @@
     </w:tblPr>
     <w:tblStylePr w:type="firstRow">
       <w:rPr>
-        <w:rFonts w:asciiTheme="majorHAnsi" w:eastAsiaTheme="majorEastAsia" w:hAnsiTheme="majorHAnsi" w:cstheme="majorBidi"/>
+        <w:rFonts w:cstheme="majorBidi"/>
       </w:rPr>
       <w:tblPr/>
       <w:tcPr>
@@ -6468,7 +7515,7 @@
     </w:tblPr>
     <w:tblStylePr w:type="firstRow">
       <w:rPr>
-        <w:rFonts w:asciiTheme="majorHAnsi" w:eastAsiaTheme="majorEastAsia" w:hAnsiTheme="majorHAnsi" w:cstheme="majorBidi"/>
+        <w:rFonts w:cstheme="majorBidi"/>
       </w:rPr>
       <w:tblPr/>
       <w:tcPr>
@@ -6552,7 +7599,7 @@
     </w:tblPr>
     <w:tblStylePr w:type="firstRow">
       <w:rPr>
-        <w:rFonts w:asciiTheme="majorHAnsi" w:eastAsiaTheme="majorEastAsia" w:hAnsiTheme="majorHAnsi" w:cstheme="majorBidi"/>
+        <w:rFonts w:cstheme="majorBidi"/>
       </w:rPr>
       <w:tblPr/>
       <w:tcPr>
@@ -6636,7 +7683,7 @@
     </w:tblPr>
     <w:tblStylePr w:type="firstRow">
       <w:rPr>
-        <w:rFonts w:asciiTheme="majorHAnsi" w:eastAsiaTheme="majorEastAsia" w:hAnsiTheme="majorHAnsi" w:cstheme="majorBidi"/>
+        <w:rFonts w:cstheme="majorBidi"/>
       </w:rPr>
       <w:tblPr/>
       <w:tcPr>
@@ -6720,7 +7767,7 @@
     </w:tblPr>
     <w:tblStylePr w:type="firstRow">
       <w:rPr>
-        <w:rFonts w:asciiTheme="majorHAnsi" w:eastAsiaTheme="majorEastAsia" w:hAnsiTheme="majorHAnsi" w:cstheme="majorBidi"/>
+        <w:rFonts w:cstheme="majorBidi"/>
       </w:rPr>
       <w:tblPr/>
       <w:tcPr>
@@ -6804,7 +7851,7 @@
     </w:tblPr>
     <w:tblStylePr w:type="firstRow">
       <w:rPr>
-        <w:rFonts w:asciiTheme="majorHAnsi" w:eastAsiaTheme="majorEastAsia" w:hAnsiTheme="majorHAnsi" w:cstheme="majorBidi"/>
+        <w:rFonts w:cstheme="majorBidi"/>
       </w:rPr>
       <w:tblPr/>
       <w:tcPr>
@@ -6888,7 +7935,7 @@
     </w:tblPr>
     <w:tblStylePr w:type="firstRow">
       <w:rPr>
-        <w:rFonts w:asciiTheme="majorHAnsi" w:eastAsiaTheme="majorEastAsia" w:hAnsiTheme="majorHAnsi" w:cstheme="majorBidi"/>
+        <w:rFonts w:cstheme="majorBidi"/>
       </w:rPr>
       <w:tblPr/>
       <w:tcPr>
@@ -6953,7 +8000,7 @@
       <w:spacing w:after="0" w:line="240" w:lineRule="auto"/>
     </w:pPr>
     <w:rPr>
-      <w:rFonts w:asciiTheme="majorHAnsi" w:eastAsiaTheme="majorEastAsia" w:hAnsiTheme="majorHAnsi" w:cstheme="majorBidi"/>
+      <w:rFonts w:cstheme="majorBidi"/>
       <w:color w:val="000000" w:themeColor="text1"/>
     </w:rPr>
     <w:tblPr>
@@ -7081,7 +8128,7 @@
       <w:spacing w:after="0" w:line="240" w:lineRule="auto"/>
     </w:pPr>
     <w:rPr>
-      <w:rFonts w:asciiTheme="majorHAnsi" w:eastAsiaTheme="majorEastAsia" w:hAnsiTheme="majorHAnsi" w:cstheme="majorBidi"/>
+      <w:rFonts w:cstheme="majorBidi"/>
       <w:color w:val="000000" w:themeColor="text1"/>
     </w:rPr>
     <w:tblPr>
@@ -7209,7 +8256,7 @@
       <w:spacing w:after="0" w:line="240" w:lineRule="auto"/>
     </w:pPr>
     <w:rPr>
-      <w:rFonts w:asciiTheme="majorHAnsi" w:eastAsiaTheme="majorEastAsia" w:hAnsiTheme="majorHAnsi" w:cstheme="majorBidi"/>
+      <w:rFonts w:cstheme="majorBidi"/>
       <w:color w:val="000000" w:themeColor="text1"/>
     </w:rPr>
     <w:tblPr>
@@ -7337,7 +8384,7 @@
       <w:spacing w:after="0" w:line="240" w:lineRule="auto"/>
     </w:pPr>
     <w:rPr>
-      <w:rFonts w:asciiTheme="majorHAnsi" w:eastAsiaTheme="majorEastAsia" w:hAnsiTheme="majorHAnsi" w:cstheme="majorBidi"/>
+      <w:rFonts w:cstheme="majorBidi"/>
       <w:color w:val="000000" w:themeColor="text1"/>
     </w:rPr>
     <w:tblPr>
@@ -7465,7 +8512,7 @@
       <w:spacing w:after="0" w:line="240" w:lineRule="auto"/>
     </w:pPr>
     <w:rPr>
-      <w:rFonts w:asciiTheme="majorHAnsi" w:eastAsiaTheme="majorEastAsia" w:hAnsiTheme="majorHAnsi" w:cstheme="majorBidi"/>
+      <w:rFonts w:cstheme="majorBidi"/>
       <w:color w:val="000000" w:themeColor="text1"/>
     </w:rPr>
     <w:tblPr>
@@ -7593,7 +8640,7 @@
       <w:spacing w:after="0" w:line="240" w:lineRule="auto"/>
     </w:pPr>
     <w:rPr>
-      <w:rFonts w:asciiTheme="majorHAnsi" w:eastAsiaTheme="majorEastAsia" w:hAnsiTheme="majorHAnsi" w:cstheme="majorBidi"/>
+      <w:rFonts w:cstheme="majorBidi"/>
       <w:color w:val="000000" w:themeColor="text1"/>
     </w:rPr>
     <w:tblPr>
@@ -7721,7 +8768,7 @@
       <w:spacing w:after="0" w:line="240" w:lineRule="auto"/>
     </w:pPr>
     <w:rPr>
-      <w:rFonts w:asciiTheme="majorHAnsi" w:eastAsiaTheme="majorEastAsia" w:hAnsiTheme="majorHAnsi" w:cstheme="majorBidi"/>
+      <w:rFonts w:cstheme="majorBidi"/>
       <w:color w:val="000000" w:themeColor="text1"/>
     </w:rPr>
     <w:tblPr>
@@ -8360,7 +9407,7 @@
       <w:spacing w:after="0" w:line="240" w:lineRule="auto"/>
     </w:pPr>
     <w:rPr>
-      <w:rFonts w:asciiTheme="majorHAnsi" w:eastAsiaTheme="majorEastAsia" w:hAnsiTheme="majorHAnsi" w:cstheme="majorBidi"/>
+      <w:rFonts w:cstheme="majorBidi"/>
       <w:color w:val="000000" w:themeColor="text1"/>
     </w:rPr>
     <w:tblPr>
@@ -8485,7 +9532,7 @@
       <w:spacing w:after="0" w:line="240" w:lineRule="auto"/>
     </w:pPr>
     <w:rPr>
-      <w:rFonts w:asciiTheme="majorHAnsi" w:eastAsiaTheme="majorEastAsia" w:hAnsiTheme="majorHAnsi" w:cstheme="majorBidi"/>
+      <w:rFonts w:cstheme="majorBidi"/>
       <w:color w:val="000000" w:themeColor="text1"/>
     </w:rPr>
     <w:tblPr>
@@ -8610,7 +9657,7 @@
       <w:spacing w:after="0" w:line="240" w:lineRule="auto"/>
     </w:pPr>
     <w:rPr>
-      <w:rFonts w:asciiTheme="majorHAnsi" w:eastAsiaTheme="majorEastAsia" w:hAnsiTheme="majorHAnsi" w:cstheme="majorBidi"/>
+      <w:rFonts w:cstheme="majorBidi"/>
       <w:color w:val="000000" w:themeColor="text1"/>
     </w:rPr>
     <w:tblPr>
@@ -8735,7 +9782,7 @@
       <w:spacing w:after="0" w:line="240" w:lineRule="auto"/>
     </w:pPr>
     <w:rPr>
-      <w:rFonts w:asciiTheme="majorHAnsi" w:eastAsiaTheme="majorEastAsia" w:hAnsiTheme="majorHAnsi" w:cstheme="majorBidi"/>
+      <w:rFonts w:cstheme="majorBidi"/>
       <w:color w:val="000000" w:themeColor="text1"/>
     </w:rPr>
     <w:tblPr>
@@ -8860,7 +9907,7 @@
       <w:spacing w:after="0" w:line="240" w:lineRule="auto"/>
     </w:pPr>
     <w:rPr>
-      <w:rFonts w:asciiTheme="majorHAnsi" w:eastAsiaTheme="majorEastAsia" w:hAnsiTheme="majorHAnsi" w:cstheme="majorBidi"/>
+      <w:rFonts w:cstheme="majorBidi"/>
       <w:color w:val="000000" w:themeColor="text1"/>
     </w:rPr>
     <w:tblPr>
@@ -8985,7 +10032,7 @@
       <w:spacing w:after="0" w:line="240" w:lineRule="auto"/>
     </w:pPr>
     <w:rPr>
-      <w:rFonts w:asciiTheme="majorHAnsi" w:eastAsiaTheme="majorEastAsia" w:hAnsiTheme="majorHAnsi" w:cstheme="majorBidi"/>
+      <w:rFonts w:cstheme="majorBidi"/>
       <w:color w:val="000000" w:themeColor="text1"/>
     </w:rPr>
     <w:tblPr>
@@ -9110,7 +10157,7 @@
       <w:spacing w:after="0" w:line="240" w:lineRule="auto"/>
     </w:pPr>
     <w:rPr>
-      <w:rFonts w:asciiTheme="majorHAnsi" w:eastAsiaTheme="majorEastAsia" w:hAnsiTheme="majorHAnsi" w:cstheme="majorBidi"/>
+      <w:rFonts w:cstheme="majorBidi"/>
       <w:color w:val="000000" w:themeColor="text1"/>
     </w:rPr>
     <w:tblPr>

</xml_diff>